<commit_message>
Bring Chapters I, II, IV, V up to Chapter III's depth
Each chapter now carries a chapter-specific evidence (technical brief), mirroring
Chapter III's essay-plus-brief structure:
- Ch I (Russia 1905): the Russian loan on the Paris market (Le Temps) + the "1905
  was a bond story" seasonal-deviation test.
- Ch II (Bosnia 1908-09): Lansburgh's near-silence.
- Ch IV (Balkans 1912-13): Vienna via the Neue Freie Presse + Lansburgh's Balkan
  section + the detrended test (its strongest case gets the fullest brief).
- Ch V (July 1914): mechanism-not-motive and the one archival test.

Assembled from finance_diplomacy_1905_1906, crisis_deviation_five_cases,
lansburgh_other_crises_1914, continental_press_warscares, and
july1914_mechanism_and_archival_test, inserted before the following chapter head.
Volume 1241 -> 1509 paragraphs; still passes the OOXML XSD validator.

Co-Authored-By: Claude Opus 4.8 <noreply@anthropic.com>
Claude-Session: https://claude.ai/code/session_01LTBRX2zXDymEQ4c8u68vuY
</commit_message>
<xml_diff>
--- a/docs/What-Really-Matters.docx
+++ b/docs/What-Really-Matters.docx
@@ -2362,6 +2362,802 @@
     </w:p>
     <w:p>
       <w:pPr>
+        <w:pStyle w:val="Heading4"/>
+      </w:pPr>
+      <w:r>
+        <w:t xml:space="preserve">Chapter I — the evidence: the Russian loan on the Paris market (Le Temps), and the 1905 bond test</w:t>
+      </w:r>
+    </w:p>
+    <w:p>
+      <w:r>
+        <w:t xml:space="preserve">The 1905 Russian collapse moved French diplomacy through two doors: it forced a </w:t>
+      </w:r>
+      <w:r>
+        <w:rPr>
+          <w:b/>
+        </w:rPr>
+        <w:t xml:space="preserve">retreat</w:t>
+      </w:r>
+      <w:r>
+        <w:t xml:space="preserve"> in 1905, then French capital became the </w:t>
+      </w:r>
+      <w:r>
+        <w:rPr>
+          <w:b/>
+        </w:rPr>
+        <w:t xml:space="preserve">lever</w:t>
+      </w:r>
+      <w:r>
+        <w:t xml:space="preserve"> that turned weakness into a 1906 win. Both ends are documented in </w:t>
+      </w:r>
+      <w:r>
+        <w:rPr>
+          <w:i/>
+        </w:rPr>
+        <w:t xml:space="preserve">Le Temps</w:t>
+      </w:r>
+      <w:r>
+        <w:t xml:space="preserve"> (Gallica ALTO OCR; figures/quotes verify against the page images).</w:t>
+      </w:r>
+    </w:p>
+    <w:p>
+      <w:pPr>
+        <w:pStyle w:val="Quote"/>
+      </w:pPr>
+      <w:r>
+        <w:rPr>
+          <w:b/>
+        </w:rPr>
+        <w:t xml:space="preserve">Causal caution (read before using any of this).</w:t>
+      </w:r>
+      <w:r>
+        <w:t xml:space="preserve"> The 1905 constraint on France was </w:t>
+      </w:r>
+      <w:r>
+        <w:rPr>
+          <w:b/>
+        </w:rPr>
+        <w:t xml:space="preserve">military-strategic, not financial</w:t>
+      </w:r>
+      <w:r>
+        <w:t xml:space="preserve">: with Russia crushed at Mukden/Tsushima and in revolution, France had no usable ally against Germany and so could not stand firm over Morocco. Finance did </w:t>
+      </w:r>
+      <w:r>
+        <w:rPr>
+          <w:b/>
+        </w:rPr>
+        <w:t xml:space="preserve">not</w:t>
+      </w:r>
+      <w:r>
+        <w:t xml:space="preserve"> tie France's hands here — the </w:t>
+      </w:r>
+      <w:r>
+        <w:rPr>
+          <w:i/>
+        </w:rPr>
+        <w:t xml:space="preserve">fonds russes</w:t>
+      </w:r>
+      <w:r>
+        <w:t xml:space="preserve"> crash is a </w:t>
+      </w:r>
+      <w:r>
+        <w:rPr>
+          <w:b/>
+        </w:rPr>
+        <w:t xml:space="preserve">symptom</w:t>
+      </w:r>
+      <w:r>
+        <w:t xml:space="preserve"> of Russia's condition, not the cause of the retreat, and </w:t>
+      </w:r>
+      <w:r>
+        <w:rPr>
+          <w:i/>
+        </w:rPr>
+        <w:t xml:space="preserve">Le Temps</w:t>
+      </w:r>
+      <w:r>
+        <w:t xml:space="preserve"> blames the Fez failure and its European backlash, not bondholders. Finance does real causal work only in the </w:t>
+      </w:r>
+      <w:r>
+        <w:rPr>
+          <w:b/>
+        </w:rPr>
+        <w:t xml:space="preserve">1906 lever</w:t>
+      </w:r>
+      <w:r>
+        <w:t xml:space="preserve"> (creditor power over a desperate Russia), which shaped the </w:t>
+      </w:r>
+      <w:r>
+        <w:rPr>
+          <w:i/>
+        </w:rPr>
+        <w:t xml:space="preserve">recovery</w:t>
+      </w:r>
+      <w:r>
+        <w:t xml:space="preserve">, not the paralysis — and even that quid-pro-quo is inferred from timing. So do </w:t>
+      </w:r>
+      <w:r>
+        <w:rPr>
+          <w:b/>
+        </w:rPr>
+        <w:t xml:space="preserve">not</w:t>
+      </w:r>
+      <w:r>
+        <w:t xml:space="preserve"> write "finance constrained France." The defensible claim is narrower: </w:t>
+      </w:r>
+      <w:r>
+        <w:rPr>
+          <w:i/>
+        </w:rPr>
+        <w:t xml:space="preserve">France's diplomacy was hostage to its ally's military fortunes; finance was the alliance's substrate, a 1905 casualty, and the 1906 instrument of leverage.</w:t>
+      </w:r>
+    </w:p>
+    <w:p>
+      <w:pPr>
+        <w:pStyle w:val="Heading4"/>
+      </w:pPr>
+      <w:r>
+        <w:t xml:space="preserve">The retreat — Delcassé forced out (Le Temps, 7 June 1905)</w:t>
+      </w:r>
+    </w:p>
+    <w:p>
+      <w:r>
+        <w:t xml:space="preserve">With Russia — France's continental counterweight — crushed by Japan and convulsed by revolution, France could not confront Germany over Morocco. </w:t>
+      </w:r>
+      <w:r>
+        <w:rPr>
+          <w:i/>
+        </w:rPr>
+        <w:t xml:space="preserve">Le Temps</w:t>
+      </w:r>
+      <w:r>
+        <w:t xml:space="preserve"> reports the resignation and names the cause: the Moroccan failure and its European (German) backlash.</w:t>
+      </w:r>
+    </w:p>
+    <w:p>
+      <w:pPr>
+        <w:pStyle w:val="Quote"/>
+      </w:pPr>
+      <w:r>
+        <w:rPr>
+          <w:i/>
+        </w:rPr>
+        <w:t xml:space="preserve">"…la crise qui retire à M. Delcassé, après sept ans révolus, le portefeuille des affaires étrangères."</w:t>
+      </w:r>
+      <w:r>
+        <w:t xml:space="preserve">  </w:t>
+      </w:r>
+      <w:r>
+        <w:rPr>
+          <w:i/>
+        </w:rPr>
+        <w:t xml:space="preserve">"Le conseil des ministres… a abouti à la démission de M. Delcassé. Il a paru qu'après l'échec de la mission française à Fez et le contre-coup fâcheux que cet échec a produit en Europe…"</w:t>
+      </w:r>
+      <w:r>
+        <w:t xml:space="preserve">  </w:t>
+      </w:r>
+      <w:r>
+        <w:rPr>
+          <w:i/>
+        </w:rPr>
+        <w:t xml:space="preserve">"M. Rouvier s'est chargé de l'intérim des affaires étrangères."</w:t>
+      </w:r>
+    </w:p>
+    <w:p>
+      <w:r>
+        <w:t xml:space="preserve">So the primary text gives the chain directly: </w:t>
+      </w:r>
+      <w:r>
+        <w:rPr>
+          <w:b/>
+        </w:rPr>
+        <w:t xml:space="preserve">the Moroccan reverse (the Fez mission) and its "contre-coup fâcheux en Europe" (German pressure) → Delcassé's fall → Rouvier</w:t>
+      </w:r>
+      <w:r>
+        <w:t xml:space="preserve"> — the financier-premier — </w:t>
+      </w:r>
+      <w:r>
+        <w:rPr>
+          <w:b/>
+        </w:rPr>
+        <w:t xml:space="preserve">taking the Quai d'Orsay</w:t>
+      </w:r>
+      <w:r>
+        <w:t xml:space="preserve"> and steering toward conciliation and the Algeciras Conference. (The </w:t>
+      </w:r>
+      <w:r>
+        <w:rPr>
+          <w:i/>
+        </w:rPr>
+        <w:t xml:space="preserve">reason</w:t>
+      </w:r>
+      <w:r>
+        <w:t xml:space="preserve"> France could not stand firm — the ally's prostration — is the standard historians' background; what </w:t>
+      </w:r>
+      <w:r>
+        <w:rPr>
+          <w:i/>
+        </w:rPr>
+        <w:t xml:space="preserve">Le Temps</w:t>
+      </w:r>
+      <w:r>
+        <w:t xml:space="preserve"> states outright is the Morocco → German-pressure → resignation sequence.)</w:t>
+      </w:r>
+    </w:p>
+    <w:p>
+      <w:pPr>
+        <w:pStyle w:val="Heading4"/>
+      </w:pPr>
+      <w:r>
+        <w:t xml:space="preserve">The lever — the Russian loan on the Paris market (Le Temps, 16–21 April 1906)</w:t>
+      </w:r>
+    </w:p>
+    <w:p>
+      <w:r>
+        <w:t xml:space="preserve">Days after the Algeciras Act was signed (7 April 1906), the great Russian loan — the one that saved the post-war, post-revolution Tsarist regime — was floated </w:t>
+      </w:r>
+      <w:r>
+        <w:rPr>
+          <w:b/>
+        </w:rPr>
+        <w:t xml:space="preserve">on the French market</w:t>
+      </w:r>
+      <w:r>
+        <w:t xml:space="preserve">, and </w:t>
+      </w:r>
+      <w:r>
+        <w:rPr>
+          <w:i/>
+        </w:rPr>
+        <w:t xml:space="preserve">Le Temps</w:t>
+      </w:r>
+      <w:r>
+        <w:t xml:space="preserve"> is full of it:</w:t>
+      </w:r>
+    </w:p>
+    <w:p>
+      <w:pPr>
+        <w:pStyle w:val="Quote"/>
+      </w:pPr>
+      <w:r>
+        <w:rPr>
+          <w:i/>
+        </w:rPr>
+        <w:t xml:space="preserve">"…emprunts russes à long terme qui seraient émis sur le marché français…"</w:t>
+      </w:r>
+      <w:r>
+        <w:t xml:space="preserve"> (21 Apr)  </w:t>
+      </w:r>
+      <w:r>
+        <w:rPr>
+          <w:i/>
+        </w:rPr>
+        <w:t xml:space="preserve">"…l'emprunt russe. La Bourse commençait à s'énerver et à craindre que des difficultés ayant surgi au dernier moment, l'opération fût remise à une date indéterminée."</w:t>
+      </w:r>
+      <w:r>
+        <w:t xml:space="preserve"> (16 Apr)  Jaurès, opposing it: </w:t>
+      </w:r>
+      <w:r>
+        <w:rPr>
+          <w:i/>
+        </w:rPr>
+        <w:t xml:space="preserve">"…nouvel emprunt russe dont le produit ne servirait qu'à opprimer de nouveau le peuple russe qui vient à la lumière et à la liberté."</w:t>
+      </w:r>
+      <w:r>
+        <w:t xml:space="preserve"> (16 Apr)</w:t>
+      </w:r>
+    </w:p>
+    <w:p>
+      <w:r>
+        <w:t xml:space="preserve">The primary record thus confirms the </w:t>
+      </w:r>
+      <w:r>
+        <w:rPr>
+          <w:b/>
+        </w:rPr>
+        <w:t xml:space="preserve">sequence and the salience</w:t>
+      </w:r>
+      <w:r>
+        <w:t xml:space="preserve">: France floats the loan that Russia cannot live without, on the Paris market, within days of Algeciras, and it is a first-order political question in Paris (Jaurès and the left fought it precisely because it propped a foreign regime with French savings). The </w:t>
+      </w:r>
+      <w:r>
+        <w:rPr>
+          <w:b/>
+        </w:rPr>
+        <w:t xml:space="preserve">explicit quid-pro-quo</w:t>
+      </w:r>
+      <w:r>
+        <w:t xml:space="preserve"> — that Russia backed France at Algeciras </w:t>
+      </w:r>
+      <w:r>
+        <w:rPr>
+          <w:i/>
+        </w:rPr>
+        <w:t xml:space="preserve">in exchange for</w:t>
+      </w:r>
+      <w:r>
+        <w:t xml:space="preserve"> the loan — is the historians' reading of this timing; </w:t>
+      </w:r>
+      <w:r>
+        <w:rPr>
+          <w:i/>
+        </w:rPr>
+        <w:t xml:space="preserve">Le Temps</w:t>
+      </w:r>
+      <w:r>
+        <w:t xml:space="preserve"> documents the tight sequence and the financial dependence, not a signed bargain. Stated conservatively: French capital and French diplomacy toward Russia moved in lock-step across 1905–06, and the loan was both a rescue of the ally and an instrument of the alliance.</w:t>
+      </w:r>
+    </w:p>
+    <w:p>
+      <w:pPr>
+        <w:pStyle w:val="Heading4"/>
+      </w:pPr>
+      <w:r>
+        <w:t xml:space="preserve">The through-line</w:t>
+      </w:r>
+    </w:p>
+    <w:p>
+      <w:pPr>
+        <w:pStyle w:val="ListParagraph"/>
+        <w:ind w:left="360" w:hanging="360"/>
+      </w:pPr>
+      <w:r>
+        <w:t xml:space="preserve">•  </w:t>
+      </w:r>
+      <w:r>
+        <w:rPr>
+          <w:b/>
+        </w:rPr>
+        <w:t xml:space="preserve">1905:</w:t>
+      </w:r>
+      <w:r>
+        <w:t xml:space="preserve"> Russian military/financial collapse (the </w:t>
+      </w:r>
+      <w:r>
+        <w:rPr>
+          <w:i/>
+        </w:rPr>
+        <w:t xml:space="preserve">fonds russes</w:t>
+      </w:r>
+      <w:r>
+        <w:t xml:space="preserve"> crashing on the</w:t>
+      </w:r>
+    </w:p>
+    <w:p>
+      <w:r>
+        <w:t xml:space="preserve">  Revolution — see </w:t>
+      </w:r>
+      <w:r>
+        <w:rPr>
+          <w:rFonts w:ascii="Consolas" w:hAnsi="Consolas"/>
+          <w:sz w:val="18"/>
+        </w:rPr>
+        <w:t xml:space="preserve">french_russian_bonds_1905.csv</w:t>
+      </w:r>
+      <w:r>
+        <w:t xml:space="preserve">) → France diplomatically paralyzed →   Delcassé out, conciliation over Morocco.</w:t>
+      </w:r>
+    </w:p>
+    <w:p>
+      <w:pPr>
+        <w:pStyle w:val="ListParagraph"/>
+        <w:ind w:left="360" w:hanging="360"/>
+      </w:pPr>
+      <w:r>
+        <w:t xml:space="preserve">•  </w:t>
+      </w:r>
+      <w:r>
+        <w:rPr>
+          <w:b/>
+        </w:rPr>
+        <w:t xml:space="preserve">1906:</w:t>
+      </w:r>
+      <w:r>
+        <w:t xml:space="preserve"> order restored, the bonds recover, and France's creditor power over a desperate</w:t>
+      </w:r>
+    </w:p>
+    <w:p>
+      <w:r>
+        <w:t xml:space="preserve">  Russia becomes leverage → the loan floated at the Algeciras close → Germany isolated,   the Entente hardened, Russia drawn closer (toward the 1907 Anglo-Russian Entente).</w:t>
+      </w:r>
+    </w:p>
+    <w:p>
+      <w:r>
+        <w:t xml:space="preserve">France's </w:t>
+      </w:r>
+      <w:r>
+        <w:rPr>
+          <w:i/>
+        </w:rPr>
+        <w:t xml:space="preserve">strategic</w:t>
+      </w:r>
+      <w:r>
+        <w:t xml:space="preserve"> risk in this period was the loss of its ally's </w:t>
+      </w:r>
+      <w:r>
+        <w:rPr>
+          <w:b/>
+        </w:rPr>
+        <w:t xml:space="preserve">military</w:t>
+      </w:r>
+      <w:r>
+        <w:t xml:space="preserve"> value; its </w:t>
+      </w:r>
+      <w:r>
+        <w:rPr>
+          <w:i/>
+        </w:rPr>
+        <w:t xml:space="preserve">financial</w:t>
+      </w:r>
+      <w:r>
+        <w:t xml:space="preserve"> exposure to that crisis lived in the </w:t>
+      </w:r>
+      <w:r>
+        <w:rPr>
+          <w:b/>
+        </w:rPr>
+        <w:t xml:space="preserve">sovereign-bond market</w:t>
+      </w:r>
+      <w:r>
+        <w:t xml:space="preserve"> (French holdings of Russian debt), not the money market — which is why the Tangier money-market test read null, and why the financial side of the story has to be told through the </w:t>
+      </w:r>
+      <w:r>
+        <w:rPr>
+          <w:i/>
+        </w:rPr>
+        <w:t xml:space="preserve">fonds russes</w:t>
+      </w:r>
+      <w:r>
+        <w:t xml:space="preserve"> and the loan. The two are linked but distinct: the bond market measures the exposure, not the constraint.</w:t>
+      </w:r>
+    </w:p>
+    <w:p>
+      <w:pPr>
+        <w:pStyle w:val="Heading4"/>
+      </w:pPr>
+      <w:r>
+        <w:t xml:space="preserve">Sources</w:t>
+      </w:r>
+    </w:p>
+    <w:p>
+      <w:r>
+        <w:rPr>
+          <w:i/>
+        </w:rPr>
+        <w:t xml:space="preserve">Le Temps</w:t>
+      </w:r>
+      <w:r>
+        <w:t xml:space="preserve"> (Gallica/BnF, public domain): 7 June 1905 (</w:t>
+      </w:r>
+      <w:r>
+        <w:rPr>
+          <w:rFonts w:ascii="Consolas" w:hAnsi="Consolas"/>
+          <w:sz w:val="18"/>
+        </w:rPr>
+        <w:t xml:space="preserve">bpt6k238270b</w:t>
+      </w:r>
+      <w:r>
+        <w:t xml:space="preserve">); 16–21 April 1906 (</w:t>
+      </w:r>
+      <w:r>
+        <w:rPr>
+          <w:rFonts w:ascii="Consolas" w:hAnsi="Consolas"/>
+          <w:sz w:val="18"/>
+        </w:rPr>
+        <w:t xml:space="preserve">bpt6k2385891</w:t>
+      </w:r>
+      <w:r>
+        <w:t xml:space="preserve">, </w:t>
+      </w:r>
+      <w:r>
+        <w:rPr>
+          <w:rFonts w:ascii="Consolas" w:hAnsi="Consolas"/>
+          <w:sz w:val="18"/>
+        </w:rPr>
+        <w:t xml:space="preserve">bpt6k238590z</w:t>
+      </w:r>
+      <w:r>
+        <w:t xml:space="preserve">, </w:t>
+      </w:r>
+      <w:r>
+        <w:rPr>
+          <w:rFonts w:ascii="Consolas" w:hAnsi="Consolas"/>
+          <w:sz w:val="18"/>
+        </w:rPr>
+        <w:t xml:space="preserve">bpt6k238591b</w:t>
+      </w:r>
+      <w:r>
+        <w:t xml:space="preserve">, </w:t>
+      </w:r>
+      <w:r>
+        <w:rPr>
+          <w:rFonts w:ascii="Consolas" w:hAnsi="Consolas"/>
+          <w:sz w:val="18"/>
+        </w:rPr>
+        <w:t xml:space="preserve">bpt6k238594g</w:t>
+      </w:r>
+      <w:r>
+        <w:t xml:space="preserve">). OCR — verify quotes against the page images. Companion data: </w:t>
+      </w:r>
+      <w:r>
+        <w:rPr>
+          <w:rFonts w:ascii="Consolas" w:hAnsi="Consolas"/>
+          <w:sz w:val="18"/>
+        </w:rPr>
+        <w:t xml:space="preserve">war_premia/data/french_russian_bonds_1905.csv</w:t>
+      </w:r>
+      <w:r>
+        <w:t xml:space="preserve">.</w:t>
+      </w:r>
+    </w:p>
+    <w:p>
+      <w:pPr>
+        <w:pStyle w:val="Heading4"/>
+      </w:pPr>
+      <w:r>
+        <w:t xml:space="preserve">1905 was Russian, not Moroccan — and it was a </w:t>
+      </w:r>
+      <w:r>
+        <w:rPr>
+          <w:i/>
+        </w:rPr>
+        <w:t xml:space="preserve">bond</w:t>
+      </w:r>
+      <w:r>
+        <w:t xml:space="preserve"> story, not a money-market one</w:t>
+      </w:r>
+    </w:p>
+    <w:p>
+      <w:r>
+        <w:t xml:space="preserve">The Tangier "null" needs the right reading. France's financial distress in 1905 was not Moroccan — it was </w:t>
+      </w:r>
+      <w:r>
+        <w:rPr>
+          <w:b/>
+        </w:rPr>
+        <w:t xml:space="preserve">Russian</w:t>
+      </w:r>
+      <w:r>
+        <w:t xml:space="preserve">: France was Russia's creditor, and the Russo-Japanese defeat plus the 1905 Revolution battered French-held Russian paper. That is why the </w:t>
+      </w:r>
+      <w:r>
+        <w:rPr>
+          <w:i/>
+        </w:rPr>
+        <w:t xml:space="preserve">money-market</w:t>
+      </w:r>
+      <w:r>
+        <w:t xml:space="preserve"> test shows nothing for Tangier — the stress lived in the </w:t>
+      </w:r>
+      <w:r>
+        <w:rPr>
+          <w:b/>
+        </w:rPr>
+        <w:t xml:space="preserve">bond market</w:t>
+      </w:r>
+      <w:r>
+        <w:t xml:space="preserve"> (the </w:t>
+      </w:r>
+      <w:r>
+        <w:rPr>
+          <w:i/>
+        </w:rPr>
+        <w:t xml:space="preserve">fonds russes</w:t>
+      </w:r>
+      <w:r>
+        <w:t xml:space="preserve">), which a discount-rate test cannot see. </w:t>
+      </w:r>
+      <w:r>
+        <w:rPr>
+          <w:i/>
+        </w:rPr>
+        <w:t xml:space="preserve">Le Temps</w:t>
+      </w:r>
+      <w:r>
+        <w:t xml:space="preserve">'s finance column says it outright:</w:t>
+      </w:r>
+    </w:p>
+    <w:p>
+      <w:pPr>
+        <w:pStyle w:val="ListParagraph"/>
+        <w:ind w:left="360" w:hanging="360"/>
+      </w:pPr>
+      <w:r>
+        <w:t xml:space="preserve">•  </w:t>
+      </w:r>
+      <w:r>
+        <w:rPr>
+          <w:b/>
+        </w:rPr>
+        <w:t xml:space="preserve">Post-Tsushima, 31 May 1905:</w:t>
+      </w:r>
+      <w:r>
+        <w:t xml:space="preserve"> *"Les fonds russes sont plus lourds: le 3 % 1891 de</w:t>
+      </w:r>
+    </w:p>
+    <w:p>
+      <w:r>
+        <w:t xml:space="preserve">  73.60 à 73.50; le 4 % 1901 de 88.75 à 88.60…"* [OCR — verify] — Russian bonds weaken on   the naval catastrophe (the front page is given over to "le drame de Tsou-Sima").</w:t>
+      </w:r>
+    </w:p>
+    <w:p>
+      <w:pPr>
+        <w:pStyle w:val="ListParagraph"/>
+        <w:ind w:left="360" w:hanging="360"/>
+      </w:pPr>
+      <w:r>
+        <w:t xml:space="preserve">•  </w:t>
+      </w:r>
+      <w:r>
+        <w:rPr>
+          <w:b/>
+        </w:rPr>
+        <w:t xml:space="preserve">October Manifesto, 1 Nov 1905:</w:t>
+      </w:r>
+      <w:r>
+        <w:t xml:space="preserve"> *"Les autres valeurs, qui avaient été aux séances</w:t>
+      </w:r>
+    </w:p>
+    <w:p>
+      <w:r>
+        <w:t xml:space="preserve">  précédentes influencées par la </w:t>
+      </w:r>
+      <w:r>
+        <w:rPr>
+          <w:b/>
+        </w:rPr>
+        <w:t xml:space="preserve">baisse des valeurs russes</w:t>
+      </w:r>
+      <w:r>
+        <w:t xml:space="preserve">, se relèvent aujourd'hui   avec elles."</w:t>
+      </w:r>
+      <w:r>
+        <w:rPr>
+          <w:i/>
+        </w:rPr>
+        <w:t xml:space="preserve"> The whole Paris list had been dragged by Russian paper and rallied with it   on the news of the Tsar's concessions. And the money was Russia-bound: </w:t>
+      </w:r>
+      <w:r>
+        <w:t xml:space="preserve">"…disponibilités   considérables qu'on s'était créées pour souscrire à </w:t>
+      </w:r>
+      <w:r>
+        <w:rPr>
+          <w:b/>
+        </w:rPr>
+        <w:t xml:space="preserve">l'emprunt russe</w:t>
+      </w:r>
+      <w:r>
+        <w:t xml:space="preserve">"* — cash built up   to subscribe the Russian loan (managed in Paris by Raffalovich, Russia's financial agent).</w:t>
+      </w:r>
+    </w:p>
+    <w:p>
+      <w:r>
+        <w:rPr>
+          <w:b/>
+        </w:rPr>
+        <w:t xml:space="preserve">The series</w:t>
+      </w:r>
+      <w:r>
+        <w:t xml:space="preserve"> (</w:t>
+      </w:r>
+      <w:r>
+        <w:rPr>
+          <w:rFonts w:ascii="Consolas" w:hAnsi="Consolas"/>
+          <w:sz w:val="18"/>
+        </w:rPr>
+        <w:t xml:space="preserve">war_premia/data/french_russian_bonds_1905.csv</w:t>
+      </w:r>
+      <w:r>
+        <w:t xml:space="preserve">, chart </w:t>
+      </w:r>
+      <w:r>
+        <w:rPr>
+          <w:rFonts w:ascii="Consolas" w:hAnsi="Consolas"/>
+          <w:sz w:val="18"/>
+        </w:rPr>
+        <w:t xml:space="preserve">…/results/french_russian_bonds_1905.svg</w:t>
+      </w:r>
+      <w:r>
+        <w:t xml:space="preserve">) shows the Russian Consolidé on the Paris Bourse was a barometer of the </w:t>
+      </w:r>
+      <w:r>
+        <w:rPr>
+          <w:b/>
+        </w:rPr>
+        <w:t xml:space="preserve">Revolution, not the war</w:t>
+      </w:r>
+      <w:r>
+        <w:t xml:space="preserve">: ~87 through spring, the 3% 1891 knocked to </w:t>
+      </w:r>
+      <w:r>
+        <w:rPr>
+          <w:b/>
+        </w:rPr>
+        <w:t xml:space="preserve">69</w:t>
+      </w:r>
+      <w:r>
+        <w:t xml:space="preserve"> at Bloody Sunday, </w:t>
+      </w:r>
+      <w:r>
+        <w:rPr>
+          <w:b/>
+        </w:rPr>
+        <w:t xml:space="preserve">barely dented by Tsushima</w:t>
+      </w:r>
+      <w:r>
+        <w:t xml:space="preserve"> (already priced), rallied to </w:t>
+      </w:r>
+      <w:r>
+        <w:rPr>
+          <w:b/>
+        </w:rPr>
+        <w:t xml:space="preserve">~95.6 on the Portsmouth peace</w:t>
+      </w:r>
+      <w:r>
+        <w:t xml:space="preserve"> (Sept), then </w:t>
+      </w:r>
+      <w:r>
+        <w:rPr>
+          <w:b/>
+        </w:rPr>
+        <w:t xml:space="preserve">crashed to ~81 in the December Moscow uprising</w:t>
+      </w:r>
+      <w:r>
+        <w:t xml:space="preserve">, recovering to ~85 by January 1906 as order returned and the great loan loomed. The instrument that carried France's strategic risk that year moved on Russian </w:t>
+      </w:r>
+      <w:r>
+        <w:rPr>
+          <w:i/>
+        </w:rPr>
+        <w:t xml:space="preserve">domestic collapse</w:t>
+      </w:r>
+      <w:r>
+        <w:t xml:space="preserve">, not battles — and not on Morocco at all.</w:t>
+      </w:r>
+    </w:p>
+    <w:p>
+      <w:r>
+        <w:t xml:space="preserve">So 1905 is not a quiet year mis-read as calm; it is a year whose real French financial event was </w:t>
+      </w:r>
+      <w:r>
+        <w:rPr>
+          <w:b/>
+        </w:rPr>
+        <w:t xml:space="preserve">Russian sovereign risk in the bond market</w:t>
+      </w:r>
+      <w:r>
+        <w:t xml:space="preserve">, invisible to a money-market deviation test and unrelated to Morocco. Two lessons for the manuscript: (1) the Tangier money-market null is genuine </w:t>
+      </w:r>
+      <w:r>
+        <w:rPr>
+          <w:i/>
+        </w:rPr>
+        <w:t xml:space="preserve">and</w:t>
+      </w:r>
+      <w:r>
+        <w:t xml:space="preserve"> correctly attributed — Morocco was not a Paris financial event; (2) the war-risk channel that mattered for France in 1905 ran through </w:t>
+      </w:r>
+      <w:r>
+        <w:rPr>
+          <w:b/>
+        </w:rPr>
+        <w:t xml:space="preserve">French holdings of allied (Russian) debt</w:t>
+      </w:r>
+      <w:r>
+        <w:t xml:space="preserve">, a bond-market/solvency story that belongs in the cross-section of sovereign spreads, not the discount-rate series. (This is the French mirror of the "France as Germany's creditor" mechanism in 1911 — in 1905 France's exposure was to </w:t>
+      </w:r>
+      <w:r>
+        <w:rPr>
+          <w:i/>
+        </w:rPr>
+        <w:t xml:space="preserve">Russia</w:t>
+      </w:r>
+      <w:r>
+        <w:t xml:space="preserve">.)</w:t>
+      </w:r>
+    </w:p>
+    <w:p>
+      <w:pPr>
         <w:pStyle w:val="Heading3"/>
       </w:pPr>
       <w:r>
@@ -2463,6 +3259,54 @@
     </w:p>
     <w:p>
       <w:pPr>
+        <w:pStyle w:val="Heading4"/>
+      </w:pPr>
+      <w:r>
+        <w:t xml:space="preserve">Chapter II — the evidence: Lansburgh's near-silence in the Bosnian crisis, 1908–09</w:t>
+      </w:r>
+    </w:p>
+    <w:p>
+      <w:pPr>
+        <w:pStyle w:val="Heading4"/>
+      </w:pPr>
+      <w:r>
+        <w:t xml:space="preserve">Bosnian crisis (1908–09): near silence</w:t>
+      </w:r>
+    </w:p>
+    <w:p>
+      <w:r>
+        <w:t xml:space="preserve">Lansburgh's 1908–09 money-market writing </w:t>
+      </w:r>
+      <w:r>
+        <w:rPr>
+          <w:b/>
+        </w:rPr>
+        <w:t xml:space="preserve">does not treat the annexation crisis as a financial event.</w:t>
+      </w:r>
+      <w:r>
+        <w:t xml:space="preserve"> No article that year mentions Bosnien / Annexion / Balkan / Kriegsgefahr, and "Kreditkrisen" (1909, Bd 1, 1–10) — the title one would expect to engage it — is a </w:t>
+      </w:r>
+      <w:r>
+        <w:rPr>
+          <w:i/>
+        </w:rPr>
+        <w:t xml:space="preserve">theoretical</w:t>
+      </w:r>
+      <w:r>
+        <w:t xml:space="preserve"> essay (it opens on the socialist theory of "anarchic production" and cartelisation), not crisis reporting. This matches the rate record: the money market was easy in Feb–March 1909, so the war scare left no money-market trace. A clean null — the 1908–09 crisis was diplomatic, not a German </w:t>
+      </w:r>
+      <w:r>
+        <w:rPr>
+          <w:i/>
+        </w:rPr>
+        <w:t xml:space="preserve">money-market</w:t>
+      </w:r>
+      <w:r>
+        <w:t xml:space="preserve"> crisis.</w:t>
+      </w:r>
+    </w:p>
+    <w:p>
+      <w:pPr>
         <w:pStyle w:val="Heading3"/>
       </w:pPr>
       <w:r>
@@ -4719,6 +5563,834 @@
           <w:rFonts w:ascii="Consolas" w:hAnsi="Consolas"/>
           <w:sz w:val="18"/>
         </w:rPr>
+        <w:t xml:space="preserve">#### Chapter IV — the evidence: Vienna through the Balkan Wars (Neue Freie Presse; Lansburgh; the detrended test)</w:t>
+      </w:r>
+    </w:p>
+    <w:p>
+      <w:pPr>
+        <w:pStyle w:val="Code"/>
+      </w:pPr>
+      <w:r>
+        <w:rPr>
+          <w:rFonts w:ascii="Consolas" w:hAnsi="Consolas"/>
+          <w:sz w:val="18"/>
+        </w:rPr>
+        <w:t xml:space="preserve"> </w:t>
+      </w:r>
+    </w:p>
+    <w:p>
+      <w:pPr>
+        <w:pStyle w:val="Code"/>
+      </w:pPr>
+      <w:r>
+        <w:rPr>
+          <w:rFonts w:ascii="Consolas" w:hAnsi="Consolas"/>
+          <w:sz w:val="18"/>
+        </w:rPr>
+        <w:t xml:space="preserve">##### Austria — the Vienna market through the Balkan Wars (*Neue Freie Presse*, 1912)</w:t>
+      </w:r>
+    </w:p>
+    <w:p>
+      <w:pPr>
+        <w:pStyle w:val="Code"/>
+      </w:pPr>
+      <w:r>
+        <w:rPr>
+          <w:rFonts w:ascii="Consolas" w:hAnsi="Consolas"/>
+          <w:sz w:val="18"/>
+        </w:rPr>
+        <w:t xml:space="preserve"> </w:t>
+      </w:r>
+    </w:p>
+    <w:p>
+      <w:pPr>
+        <w:pStyle w:val="Code"/>
+      </w:pPr>
+      <w:r>
+        <w:rPr>
+          <w:rFonts w:ascii="Consolas" w:hAnsi="Consolas"/>
+          <w:sz w:val="18"/>
+        </w:rPr>
+        <w:t xml:space="preserve">The Vienna question the London-based *Chronicle* couldn't answer (it quoted only a bare</w:t>
+      </w:r>
+    </w:p>
+    <w:p>
+      <w:pPr>
+        <w:pStyle w:val="Code"/>
+      </w:pPr>
+      <w:r>
+        <w:rPr>
+          <w:rFonts w:ascii="Consolas" w:hAnsi="Consolas"/>
+          <w:sz w:val="18"/>
+        </w:rPr>
+        <w:t xml:space="preserve">"Vienna 6%"): did Vienna's own market show the war scare? **Yes — sharply.**</w:t>
+      </w:r>
+    </w:p>
+    <w:p>
+      <w:pPr>
+        <w:pStyle w:val="Code"/>
+      </w:pPr>
+      <w:r>
+        <w:rPr>
+          <w:rFonts w:ascii="Consolas" w:hAnsi="Consolas"/>
+          <w:sz w:val="18"/>
+        </w:rPr>
+        <w:t xml:space="preserve"> </w:t>
+      </w:r>
+    </w:p>
+    <w:p>
+      <w:pPr>
+        <w:pStyle w:val="Code"/>
+      </w:pPr>
+      <w:r>
+        <w:rPr>
+          <w:rFonts w:ascii="Consolas" w:hAnsi="Consolas"/>
+          <w:sz w:val="18"/>
+        </w:rPr>
+        <w:t xml:space="preserve">- **The Austro-Hungarian Bank tightened step by step as the Balkan war escalated:**</w:t>
+      </w:r>
+    </w:p>
+    <w:p>
+      <w:pPr>
+        <w:pStyle w:val="Code"/>
+      </w:pPr>
+      <w:r>
+        <w:rPr>
+          <w:rFonts w:ascii="Consolas" w:hAnsi="Consolas"/>
+          <w:sz w:val="18"/>
+        </w:rPr>
+        <w:t xml:space="preserve">  bank rate **5%** (12 Oct 1912) → **5½%** (26 Oct: *"die Erhöhung des Bankzinsfußes auf</w:t>
+      </w:r>
+    </w:p>
+    <w:p>
+      <w:pPr>
+        <w:pStyle w:val="Code"/>
+      </w:pPr>
+      <w:r>
+        <w:rPr>
+          <w:rFonts w:ascii="Consolas" w:hAnsi="Consolas"/>
+          <w:sz w:val="18"/>
+        </w:rPr>
+        <w:t xml:space="preserve">  5½ Prozent"*) → **6%** (30 Nov) [verify]. The private discount rose from ~**4%** to</w:t>
+      </w:r>
+    </w:p>
+    <w:p>
+      <w:pPr>
+        <w:pStyle w:val="Code"/>
+      </w:pPr>
+      <w:r>
+        <w:rPr>
+          <w:rFonts w:ascii="Consolas" w:hAnsi="Consolas"/>
+          <w:sz w:val="18"/>
+        </w:rPr>
+        <w:t xml:space="preserve">  **5½%**.</w:t>
+      </w:r>
+    </w:p>
+    <w:p>
+      <w:pPr>
+        <w:pStyle w:val="Code"/>
+      </w:pPr>
+      <w:r>
+        <w:rPr>
+          <w:rFonts w:ascii="Consolas" w:hAnsi="Consolas"/>
+          <w:sz w:val="18"/>
+        </w:rPr>
+        <w:t xml:space="preserve">- **Vienna carried a real term structure**, which the *Chronicle*'s single figure</w:t>
+      </w:r>
+    </w:p>
+    <w:p>
+      <w:pPr>
+        <w:pStyle w:val="Code"/>
+      </w:pPr>
+      <w:r>
+        <w:rPr>
+          <w:rFonts w:ascii="Consolas" w:hAnsi="Consolas"/>
+          <w:sz w:val="18"/>
+        </w:rPr>
+        <w:t xml:space="preserve">  flattened: 30 Nov 1912 — *"Bankzinsfuß 6 Prozent, Privatdiskont 5½ Prozent, längere</w:t>
+      </w:r>
+    </w:p>
+    <w:p>
+      <w:pPr>
+        <w:pStyle w:val="Code"/>
+      </w:pPr>
+      <w:r>
+        <w:rPr>
+          <w:rFonts w:ascii="Consolas" w:hAnsi="Consolas"/>
+          <w:sz w:val="18"/>
+        </w:rPr>
+        <w:t xml:space="preserve">  Sichten 6 bis 6¼ Prozent"* (private discount below the 6% bank rate; longer bills</w:t>
+      </w:r>
+    </w:p>
+    <w:p>
+      <w:pPr>
+        <w:pStyle w:val="Code"/>
+      </w:pPr>
+      <w:r>
+        <w:rPr>
+          <w:rFonts w:ascii="Consolas" w:hAnsi="Consolas"/>
+          <w:sz w:val="18"/>
+        </w:rPr>
+        <w:t xml:space="preserve">  dearer). So the earlier "Vienna never splits" was a limit of the *Chronicle*'s</w:t>
+      </w:r>
+    </w:p>
+    <w:p>
+      <w:pPr>
+        <w:pStyle w:val="Code"/>
+      </w:pPr>
+      <w:r>
+        <w:rPr>
+          <w:rFonts w:ascii="Consolas" w:hAnsi="Consolas"/>
+          <w:sz w:val="18"/>
+        </w:rPr>
+        <w:t xml:space="preserve">  reporting, not of the Vienna market.</w:t>
+      </w:r>
+    </w:p>
+    <w:p>
+      <w:pPr>
+        <w:pStyle w:val="Code"/>
+      </w:pPr>
+      <w:r>
+        <w:rPr>
+          <w:rFonts w:ascii="Consolas" w:hAnsi="Consolas"/>
+          <w:sz w:val="18"/>
+        </w:rPr>
+        <w:t xml:space="preserve">- **The market priced the scare and its easing** — the bourse firmed on news</w:t>
+      </w:r>
+    </w:p>
+    <w:p>
+      <w:pPr>
+        <w:pStyle w:val="Code"/>
+      </w:pPr>
+      <w:r>
+        <w:rPr>
+          <w:rFonts w:ascii="Consolas" w:hAnsi="Consolas"/>
+          <w:sz w:val="18"/>
+        </w:rPr>
+        <w:t xml:space="preserve">  *"daß es wegen der schwebenden politischen Fragen nicht zu einem ernsten Zerwürfnis</w:t>
+      </w:r>
+    </w:p>
+    <w:p>
+      <w:pPr>
+        <w:pStyle w:val="Code"/>
+      </w:pPr>
+      <w:r>
+        <w:rPr>
+          <w:rFonts w:ascii="Consolas" w:hAnsi="Consolas"/>
+          <w:sz w:val="18"/>
+        </w:rPr>
+        <w:t xml:space="preserve">  unter den Großstaaten kommen werde"* (that the pending political questions would not</w:t>
+      </w:r>
+    </w:p>
+    <w:p>
+      <w:pPr>
+        <w:pStyle w:val="Code"/>
+      </w:pPr>
+      <w:r>
+        <w:rPr>
+          <w:rFonts w:ascii="Consolas" w:hAnsi="Consolas"/>
+          <w:sz w:val="18"/>
+        </w:rPr>
+        <w:t xml:space="preserve">  bring a serious rupture among the great powers).</w:t>
+      </w:r>
+    </w:p>
+    <w:p>
+      <w:pPr>
+        <w:pStyle w:val="Code"/>
+      </w:pPr>
+      <w:r>
+        <w:rPr>
+          <w:rFonts w:ascii="Consolas" w:hAnsi="Consolas"/>
+          <w:sz w:val="18"/>
+        </w:rPr>
+        <w:t xml:space="preserve">- **Bonus — a third-party check on Berlin.** NFP's Berlin telegram the same day quotes</w:t>
+      </w:r>
+    </w:p>
+    <w:p>
+      <w:pPr>
+        <w:pStyle w:val="Code"/>
+      </w:pPr>
+      <w:r>
+        <w:rPr>
+          <w:rFonts w:ascii="Consolas" w:hAnsi="Consolas"/>
+          <w:sz w:val="18"/>
+        </w:rPr>
+        <w:t xml:space="preserve">  *"über Ultimo 6 bis 7"* and *"Privatdiskont lang 5¾, kurz 6"* — the month-end</w:t>
+      </w:r>
+    </w:p>
+    <w:p>
+      <w:pPr>
+        <w:pStyle w:val="Code"/>
+      </w:pPr>
+      <w:r>
+        <w:rPr>
+          <w:rFonts w:ascii="Consolas" w:hAnsi="Consolas"/>
+          <w:sz w:val="18"/>
+        </w:rPr>
+        <w:t xml:space="preserve">  short-over-long inversion, corroborating our Berlin spot/to-arrive finding from a</w:t>
+      </w:r>
+    </w:p>
+    <w:p>
+      <w:pPr>
+        <w:pStyle w:val="Code"/>
+      </w:pPr>
+      <w:r>
+        <w:rPr>
+          <w:rFonts w:ascii="Consolas" w:hAnsi="Consolas"/>
+          <w:sz w:val="18"/>
+        </w:rPr>
+        <w:t xml:space="preserve">  Vienna source.</w:t>
+      </w:r>
+    </w:p>
+    <w:p>
+      <w:pPr>
+        <w:pStyle w:val="Code"/>
+      </w:pPr>
+      <w:r>
+        <w:rPr>
+          <w:rFonts w:ascii="Consolas" w:hAnsi="Consolas"/>
+          <w:sz w:val="18"/>
+        </w:rPr>
+        <w:t xml:space="preserve">- **July 1914:** at the outbreak the Austro-Hungarian Bank rate went to **8%** (1 Aug</w:t>
+      </w:r>
+    </w:p>
+    <w:p>
+      <w:pPr>
+        <w:pStyle w:val="Code"/>
+      </w:pPr>
+      <w:r>
+        <w:rPr>
+          <w:rFonts w:ascii="Consolas" w:hAnsi="Consolas"/>
+          <w:sz w:val="18"/>
+        </w:rPr>
+        <w:t xml:space="preserve">  1914: *"die Erhöhung des Bankzinsfußes auf 8 Prozent"*) — Vienna's share of the</w:t>
+      </w:r>
+    </w:p>
+    <w:p>
+      <w:pPr>
+        <w:pStyle w:val="Code"/>
+      </w:pPr>
+      <w:r>
+        <w:rPr>
+          <w:rFonts w:ascii="Consolas" w:hAnsi="Consolas"/>
+          <w:sz w:val="18"/>
+        </w:rPr>
+        <w:t xml:space="preserve">  worldwide August spike.</w:t>
+      </w:r>
+    </w:p>
+    <w:p>
+      <w:pPr>
+        <w:pStyle w:val="Code"/>
+      </w:pPr>
+      <w:r>
+        <w:rPr>
+          <w:rFonts w:ascii="Consolas" w:hAnsi="Consolas"/>
+          <w:sz w:val="18"/>
+        </w:rPr>
+        <w:t xml:space="preserve"> </w:t>
+      </w:r>
+    </w:p>
+    <w:p>
+      <w:pPr>
+        <w:pStyle w:val="Code"/>
+      </w:pPr>
+      <w:r>
+        <w:rPr>
+          <w:rFonts w:ascii="Consolas" w:hAnsi="Consolas"/>
+          <w:sz w:val="18"/>
+        </w:rPr>
+        <w:t xml:space="preserve">##### Balkan Wars (1912–13): a repeat of 1911, on the eastern border</w:t>
+      </w:r>
+    </w:p>
+    <w:p>
+      <w:pPr>
+        <w:pStyle w:val="Code"/>
+      </w:pPr>
+      <w:r>
+        <w:rPr>
+          <w:rFonts w:ascii="Consolas" w:hAnsi="Consolas"/>
+          <w:sz w:val="18"/>
+        </w:rPr>
+        <w:t xml:space="preserve"> </w:t>
+      </w:r>
+    </w:p>
+    <w:p>
+      <w:pPr>
+        <w:pStyle w:val="Code"/>
+      </w:pPr>
+      <w:r>
+        <w:rPr>
+          <w:rFonts w:ascii="Consolas" w:hAnsi="Consolas"/>
+          <w:sz w:val="18"/>
+        </w:rPr>
+        <w:t xml:space="preserve">**"Spargelder und Kriegsflucht"** (Bd 2, 1147–1153, late 1912) is the Balkan-winter</w:t>
+      </w:r>
+    </w:p>
+    <w:p>
+      <w:pPr>
+        <w:pStyle w:val="Code"/>
+      </w:pPr>
+      <w:r>
+        <w:rPr>
+          <w:rFonts w:ascii="Consolas" w:hAnsi="Consolas"/>
+          <w:sz w:val="18"/>
+        </w:rPr>
+        <w:t xml:space="preserve">analogue of the autumn-1911 post-mortem — the *same* deposit-run mechanism, geographically</w:t>
+      </w:r>
+    </w:p>
+    <w:p>
+      <w:pPr>
+        <w:pStyle w:val="Code"/>
+      </w:pPr>
+      <w:r>
+        <w:rPr>
+          <w:rFonts w:ascii="Consolas" w:hAnsi="Consolas"/>
+          <w:sz w:val="18"/>
+        </w:rPr>
+        <w:t xml:space="preserve">concentrated toward Russia:</w:t>
+      </w:r>
+    </w:p>
+    <w:p>
+      <w:pPr>
+        <w:pStyle w:val="Code"/>
+      </w:pPr>
+      <w:r>
+        <w:rPr>
+          <w:rFonts w:ascii="Consolas" w:hAnsi="Consolas"/>
+          <w:sz w:val="18"/>
+        </w:rPr>
+        <w:t xml:space="preserve"> </w:t>
+      </w:r>
+    </w:p>
+    <w:p>
+      <w:pPr>
+        <w:pStyle w:val="Code"/>
+      </w:pPr>
+      <w:r>
+        <w:rPr>
+          <w:rFonts w:ascii="Consolas" w:hAnsi="Consolas"/>
+          <w:sz w:val="18"/>
+        </w:rPr>
+        <w:t xml:space="preserve">&gt; *"Zahlreiche Sparer waren zu den Banken und Sparkassen gestürmt um einen Teil ihres</w:t>
+      </w:r>
+    </w:p>
+    <w:p>
+      <w:pPr>
+        <w:pStyle w:val="Code"/>
+      </w:pPr>
+      <w:r>
+        <w:rPr>
+          <w:rFonts w:ascii="Consolas" w:hAnsi="Consolas"/>
+          <w:sz w:val="18"/>
+        </w:rPr>
+        <w:t xml:space="preserve">&gt; Guthabens abzuheben oder zu kündigen… Eine Zeitlang hatte es sogar den Anschein als</w:t>
+      </w:r>
+    </w:p>
+    <w:p>
+      <w:pPr>
+        <w:pStyle w:val="Code"/>
+      </w:pPr>
+      <w:r>
+        <w:rPr>
+          <w:rFonts w:ascii="Consolas" w:hAnsi="Consolas"/>
+          <w:sz w:val="18"/>
+        </w:rPr>
+        <w:t xml:space="preserve">&gt; wenn die Reichsbank den Ansturm auf ihre Diskontkassen… mit einer weiteren Erhöhung</w:t>
+      </w:r>
+    </w:p>
+    <w:p>
+      <w:pPr>
+        <w:pStyle w:val="Code"/>
+      </w:pPr>
+      <w:r>
+        <w:rPr>
+          <w:rFonts w:ascii="Consolas" w:hAnsi="Consolas"/>
+          <w:sz w:val="18"/>
+        </w:rPr>
+        <w:t xml:space="preserve">&gt; ihres erst vor kurzem auf 6% hinaufgesetzten Diskontsatzes würde begegnen müssen."*</w:t>
+      </w:r>
+    </w:p>
+    <w:p>
+      <w:pPr>
+        <w:pStyle w:val="Code"/>
+      </w:pPr>
+      <w:r>
+        <w:rPr>
+          <w:rFonts w:ascii="Consolas" w:hAnsi="Consolas"/>
+          <w:sz w:val="18"/>
+        </w:rPr>
+        <w:t xml:space="preserve"> </w:t>
+      </w:r>
+    </w:p>
+    <w:p>
+      <w:pPr>
+        <w:pStyle w:val="Code"/>
+      </w:pPr>
+      <w:r>
+        <w:rPr>
+          <w:rFonts w:ascii="Consolas" w:hAnsi="Consolas"/>
+          <w:sz w:val="18"/>
+        </w:rPr>
+        <w:t xml:space="preserve">Savers stormed the banks and savings banks; the Reichsbank — its rate **already at 6%**</w:t>
+      </w:r>
+    </w:p>
+    <w:p>
+      <w:pPr>
+        <w:pStyle w:val="Code"/>
+      </w:pPr>
+      <w:r>
+        <w:rPr>
+          <w:rFonts w:ascii="Consolas" w:hAnsi="Consolas"/>
+          <w:sz w:val="18"/>
+        </w:rPr>
+        <w:t xml:space="preserve">[VERIFY] — nearly had to raise again. Withdrawals were largest in **East Prussia**, so</w:t>
+      </w:r>
+    </w:p>
+    <w:p>
+      <w:pPr>
+        <w:pStyle w:val="Code"/>
+      </w:pPr>
+      <w:r>
+        <w:rPr>
+          <w:rFonts w:ascii="Consolas" w:hAnsi="Consolas"/>
+          <w:sz w:val="18"/>
+        </w:rPr>
+        <w:t xml:space="preserve">the **Chancellor sent a calming telegram** to its Oberpräsident and the press opened a</w:t>
+      </w:r>
+    </w:p>
+    <w:p>
+      <w:pPr>
+        <w:pStyle w:val="Code"/>
+      </w:pPr>
+      <w:r>
+        <w:rPr>
+          <w:rFonts w:ascii="Consolas" w:hAnsi="Consolas"/>
+          <w:sz w:val="18"/>
+        </w:rPr>
+        <w:t xml:space="preserve">campaign against hoarding; the Magdeburg savings bank alone paid out **~3 M in one week**</w:t>
+      </w:r>
+    </w:p>
+    <w:p>
+      <w:pPr>
+        <w:pStyle w:val="Code"/>
+      </w:pPr>
+      <w:r>
+        <w:rPr>
+          <w:rFonts w:ascii="Consolas" w:hAnsi="Consolas"/>
+          <w:sz w:val="18"/>
+        </w:rPr>
+        <w:t xml:space="preserve">[VERIFY]. Then **"Geldklemme"** (Bd 1, 25–30, Jan 1913) records the continued squeeze:</w:t>
+      </w:r>
+    </w:p>
+    <w:p>
+      <w:pPr>
+        <w:pStyle w:val="Code"/>
+      </w:pPr>
+      <w:r>
+        <w:rPr>
+          <w:rFonts w:ascii="Consolas" w:hAnsi="Consolas"/>
+          <w:sz w:val="18"/>
+        </w:rPr>
+        <w:t xml:space="preserve">the Reichsbank president had warned for two years about excess credit and thin cash</w:t>
+      </w:r>
+    </w:p>
+    <w:p>
+      <w:pPr>
+        <w:pStyle w:val="Code"/>
+      </w:pPr>
+      <w:r>
+        <w:rPr>
+          <w:rFonts w:ascii="Consolas" w:hAnsi="Consolas"/>
+          <w:sz w:val="18"/>
+        </w:rPr>
+        <w:t xml:space="preserve">reserves; his sharpest steps were to stop discounting repeatedly-prolonged credit bills</w:t>
+      </w:r>
+    </w:p>
+    <w:p>
+      <w:pPr>
+        <w:pStyle w:val="Code"/>
+      </w:pPr>
+      <w:r>
+        <w:rPr>
+          <w:rFonts w:ascii="Consolas" w:hAnsi="Consolas"/>
+          <w:sz w:val="18"/>
+        </w:rPr>
+        <w:t xml:space="preserve">and to tighten Lombard terms. So autumn 1911 was **not unique in kind** — the Balkan</w:t>
+      </w:r>
+    </w:p>
+    <w:p>
+      <w:pPr>
+        <w:pStyle w:val="Code"/>
+      </w:pPr>
+      <w:r>
+        <w:rPr>
+          <w:rFonts w:ascii="Consolas" w:hAnsi="Consolas"/>
+          <w:sz w:val="18"/>
+        </w:rPr>
+        <w:t xml:space="preserve">winter produced the same war-fear deposit flight and Reichsbank strain (and explains why</w:t>
+      </w:r>
+    </w:p>
+    <w:p>
+      <w:pPr>
+        <w:pStyle w:val="Code"/>
+      </w:pPr>
+      <w:r>
+        <w:rPr>
+          <w:rFonts w:ascii="Consolas" w:hAnsi="Consolas"/>
+          <w:sz w:val="18"/>
+        </w:rPr>
+        <w:t xml:space="preserve">the *Chronicle* had Berlin at 6% that December, "for both spot and to arrive").</w:t>
+      </w:r>
+    </w:p>
+    <w:p>
+      <w:pPr>
+        <w:pStyle w:val="Code"/>
+      </w:pPr>
+      <w:r>
+        <w:rPr>
+          <w:rFonts w:ascii="Consolas" w:hAnsi="Consolas"/>
+          <w:sz w:val="18"/>
+        </w:rPr>
+        <w:t xml:space="preserve"> </w:t>
+      </w:r>
+    </w:p>
+    <w:p>
+      <w:pPr>
+        <w:pStyle w:val="Code"/>
+      </w:pPr>
+      <w:r>
+        <w:rPr>
+          <w:rFonts w:ascii="Consolas" w:hAnsi="Consolas"/>
+          <w:sz w:val="18"/>
+        </w:rPr>
+        <w:t xml:space="preserve">##### Detrended — remove the cyclical level, and the war signals shrink to modest</w:t>
+      </w:r>
+    </w:p>
+    <w:p>
+      <w:pPr>
+        <w:pStyle w:val="Code"/>
+      </w:pPr>
+      <w:r>
+        <w:rPr>
+          <w:rFonts w:ascii="Consolas" w:hAnsi="Consolas"/>
+          <w:sz w:val="18"/>
+        </w:rPr>
+        <w:t xml:space="preserve"> </w:t>
+      </w:r>
+    </w:p>
+    <w:p>
+      <w:pPr>
+        <w:pStyle w:val="Code"/>
+      </w:pPr>
+      <w:r>
+        <w:rPr>
+          <w:rFonts w:ascii="Consolas" w:hAnsi="Consolas"/>
+          <w:sz w:val="18"/>
+        </w:rPr>
+        <w:t xml:space="preserve">Re-running with `--detrend` (centre each year's window at its own mean, so only the</w:t>
+      </w:r>
+    </w:p>
+    <w:p>
+      <w:pPr>
+        <w:pStyle w:val="Code"/>
+      </w:pPr>
+      <w:r>
+        <w:rPr>
+          <w:rFonts w:ascii="Consolas" w:hAnsi="Consolas"/>
+          <w:sz w:val="18"/>
+        </w:rPr>
+        <w:t xml:space="preserve">within-window *shape* is compared) strips out the rate-level confound. Peak tightening</w:t>
+      </w:r>
+    </w:p>
+    <w:p>
+      <w:pPr>
+        <w:pStyle w:val="Code"/>
+      </w:pPr>
+      <w:r>
+        <w:rPr>
+          <w:rFonts w:ascii="Consolas" w:hAnsi="Consolas"/>
+          <w:sz w:val="18"/>
+        </w:rPr>
+        <w:t xml:space="preserve">above own norm, detrended:</w:t>
+      </w:r>
+    </w:p>
+    <w:p>
+      <w:pPr>
+        <w:pStyle w:val="Code"/>
+      </w:pPr>
+      <w:r>
+        <w:rPr>
+          <w:rFonts w:ascii="Consolas" w:hAnsi="Consolas"/>
+          <w:sz w:val="18"/>
+        </w:rPr>
+        <w:t xml:space="preserve"> </w:t>
+      </w:r>
+    </w:p>
+    <w:p>
+      <w:pPr>
+        <w:pStyle w:val="Code"/>
+      </w:pPr>
+      <w:r>
+        <w:rPr>
+          <w:rFonts w:ascii="Consolas" w:hAnsi="Consolas"/>
+          <w:sz w:val="18"/>
+        </w:rPr>
+        <w:t xml:space="preserve">| Crisis | Detrended peaks | Verdict |</w:t>
+      </w:r>
+    </w:p>
+    <w:p>
+      <w:pPr>
+        <w:pStyle w:val="Code"/>
+      </w:pPr>
+      <w:r>
+        <w:rPr>
+          <w:rFonts w:ascii="Consolas" w:hAnsi="Consolas"/>
+          <w:sz w:val="18"/>
+        </w:rPr>
+        <w:t xml:space="preserve">|---|---|---|</w:t>
+      </w:r>
+    </w:p>
+    <w:p>
+      <w:pPr>
+        <w:pStyle w:val="Code"/>
+      </w:pPr>
+      <w:r>
+        <w:rPr>
+          <w:rFonts w:ascii="Consolas" w:hAnsi="Consolas"/>
+          <w:sz w:val="18"/>
+        </w:rPr>
+        <w:t xml:space="preserve">| Algeciras 1906 | Berlin **+0.52** (17 Mar), Paris +0.37, London +0.33 | a small Berlin-led bump survives at the conference climax |</w:t>
+      </w:r>
+    </w:p>
+    <w:p>
+      <w:pPr>
+        <w:pStyle w:val="Code"/>
+      </w:pPr>
+      <w:r>
+        <w:rPr>
+          <w:rFonts w:ascii="Consolas" w:hAnsi="Consolas"/>
+          <w:sz w:val="18"/>
+        </w:rPr>
+        <w:t xml:space="preserve">| Tripolitania 1912 | Genoa +0.64, Berlin +0.72, Vienna +0.62 — **peaks scattered** (Feb, Mar, May) | not synchronized → stays inconclusive |</w:t>
+      </w:r>
+    </w:p>
+    <w:p>
+      <w:pPr>
+        <w:pStyle w:val="Code"/>
+      </w:pPr>
+      <w:r>
+        <w:rPr>
+          <w:rFonts w:ascii="Consolas" w:hAnsi="Consolas"/>
+          <w:sz w:val="18"/>
+        </w:rPr>
+        <w:t xml:space="preserve">| Second Balkan 1913 | London +0.64, Berlin +0.38, Paris +0.25, Vienna +0.16 — peaks at the onset week | timing survives, **magnitude collapses** (raw +2.3 was the 1913 level) |</w:t>
+      </w:r>
+    </w:p>
+    <w:p>
+      <w:pPr>
+        <w:pStyle w:val="Code"/>
+      </w:pPr>
+      <w:r>
+        <w:rPr>
+          <w:rFonts w:ascii="Consolas" w:hAnsi="Consolas"/>
+          <w:sz w:val="18"/>
+        </w:rPr>
+        <w:t xml:space="preserve">| Agadir 1911 (clean baselines) | Berlin +0.64 &amp; Paris +0.60, both 30 Sep | the two protagonists co-move at the climax |</w:t>
+      </w:r>
+    </w:p>
+    <w:p>
+      <w:pPr>
+        <w:pStyle w:val="Code"/>
+      </w:pPr>
+      <w:r>
+        <w:rPr>
+          <w:rFonts w:ascii="Consolas" w:hAnsi="Consolas"/>
+          <w:sz w:val="18"/>
+        </w:rPr>
+        <w:t xml:space="preserve"> </w:t>
+      </w:r>
+    </w:p>
+    <w:p>
+      <w:pPr>
+        <w:pStyle w:val="Code"/>
+      </w:pPr>
+      <w:r>
+        <w:rPr>
+          <w:rFonts w:ascii="Consolas" w:hAnsi="Consolas"/>
+          <w:sz w:val="18"/>
+        </w:rPr>
+        <w:t xml:space="preserve">The headline: **once the cyclical level is removed, every pre-war money-market signal is</w:t>
+      </w:r>
+    </w:p>
+    <w:p>
+      <w:pPr>
+        <w:pStyle w:val="Code"/>
+      </w:pPr>
+      <w:r>
+        <w:rPr>
+          <w:rFonts w:ascii="Consolas" w:hAnsi="Consolas"/>
+          <w:sz w:val="18"/>
+        </w:rPr>
+        <w:t xml:space="preserve">modest — roughly +0.3 to +0.7 points.** None is a dramatic squeeze; the large raw numbers</w:t>
+      </w:r>
+    </w:p>
+    <w:p>
+      <w:pPr>
+        <w:pStyle w:val="Code"/>
+      </w:pPr>
+      <w:r>
+        <w:rPr>
+          <w:rFonts w:ascii="Consolas" w:hAnsi="Consolas"/>
+          <w:sz w:val="18"/>
+        </w:rPr>
+        <w:t xml:space="preserve">were the business cycle. What survives is *timing* (synchronization at the event week),</w:t>
+      </w:r>
+    </w:p>
+    <w:p>
+      <w:pPr>
+        <w:pStyle w:val="Code"/>
+      </w:pPr>
+      <w:r>
+        <w:rPr>
+          <w:rFonts w:ascii="Consolas" w:hAnsi="Consolas"/>
+          <w:sz w:val="18"/>
+        </w:rPr>
+        <w:t xml:space="preserve">not magnitude — consistent with the spot-vs-to-arrive reversal, where the war component</w:t>
+      </w:r>
+    </w:p>
+    <w:p>
+      <w:pPr>
+        <w:pStyle w:val="Code"/>
+      </w:pPr>
+      <w:r>
+        <w:rPr>
+          <w:rFonts w:ascii="Consolas" w:hAnsi="Consolas"/>
+          <w:sz w:val="18"/>
+        </w:rPr>
+        <w:t xml:space="preserve">was likewise small once the quarter-end seasonal was controlled.</w:t>
+      </w:r>
+    </w:p>
+    <w:p>
+      <w:pPr>
+        <w:pStyle w:val="Code"/>
+      </w:pPr>
+      <w:r>
+        <w:rPr>
+          <w:rFonts w:ascii="Consolas" w:hAnsi="Consolas"/>
+          <w:sz w:val="18"/>
+        </w:rPr>
+        <w:t xml:space="preserve"> </w:t>
+      </w:r>
+    </w:p>
+    <w:p>
+      <w:pPr>
+        <w:pStyle w:val="Code"/>
+      </w:pPr>
+      <w:r>
+        <w:rPr>
+          <w:rFonts w:ascii="Consolas" w:hAnsi="Consolas"/>
+          <w:sz w:val="18"/>
+        </w:rPr>
         <w:t xml:space="preserve">### V. July 1914 — the question nobody asked</w:t>
       </w:r>
     </w:p>
@@ -4936,6 +6608,2034 @@
           <w:sz w:val="18"/>
         </w:rPr>
         <w:t xml:space="preserve">---</w:t>
+      </w:r>
+    </w:p>
+    <w:p>
+      <w:pPr>
+        <w:pStyle w:val="Code"/>
+      </w:pPr>
+      <w:r>
+        <w:rPr>
+          <w:rFonts w:ascii="Consolas" w:hAnsi="Consolas"/>
+          <w:sz w:val="18"/>
+        </w:rPr>
+        <w:t xml:space="preserve"> </w:t>
+      </w:r>
+    </w:p>
+    <w:p>
+      <w:pPr>
+        <w:pStyle w:val="Code"/>
+      </w:pPr>
+      <w:r>
+        <w:rPr>
+          <w:rFonts w:ascii="Consolas" w:hAnsi="Consolas"/>
+          <w:sz w:val="18"/>
+        </w:rPr>
+        <w:t xml:space="preserve">#### Chapter V — the evidence: mechanism, not motive, and the one archival test</w:t>
+      </w:r>
+    </w:p>
+    <w:p>
+      <w:pPr>
+        <w:pStyle w:val="Code"/>
+      </w:pPr>
+      <w:r>
+        <w:rPr>
+          <w:rFonts w:ascii="Consolas" w:hAnsi="Consolas"/>
+          <w:sz w:val="18"/>
+        </w:rPr>
+        <w:t xml:space="preserve"> </w:t>
+      </w:r>
+    </w:p>
+    <w:p>
+      <w:pPr>
+        <w:pStyle w:val="Code"/>
+      </w:pPr>
+      <w:r>
+        <w:rPr>
+          <w:rFonts w:ascii="Consolas" w:hAnsi="Consolas"/>
+          <w:sz w:val="18"/>
+        </w:rPr>
+        <w:t xml:space="preserve">##### The correction</w:t>
+      </w:r>
+    </w:p>
+    <w:p>
+      <w:pPr>
+        <w:pStyle w:val="Code"/>
+      </w:pPr>
+      <w:r>
+        <w:rPr>
+          <w:rFonts w:ascii="Consolas" w:hAnsi="Consolas"/>
+          <w:sz w:val="18"/>
+        </w:rPr>
+        <w:t xml:space="preserve"> </w:t>
+      </w:r>
+    </w:p>
+    <w:p>
+      <w:pPr>
+        <w:pStyle w:val="Code"/>
+      </w:pPr>
+      <w:r>
+        <w:rPr>
+          <w:rFonts w:ascii="Consolas" w:hAnsi="Consolas"/>
+          <w:sz w:val="18"/>
+        </w:rPr>
+        <w:t xml:space="preserve">Every *documented* motive for the July 1914 tempo is diplomatic: localize the war,</w:t>
+      </w:r>
+    </w:p>
+    <w:p>
+      <w:pPr>
+        <w:pStyle w:val="Code"/>
+      </w:pPr>
+      <w:r>
+        <w:rPr>
+          <w:rFonts w:ascii="Consolas" w:hAnsi="Consolas"/>
+          <w:sz w:val="18"/>
+        </w:rPr>
+        <w:t xml:space="preserve">present Russia and France a fait accompli, exploit the post-Sarajevo sympathy</w:t>
+      </w:r>
+    </w:p>
+    <w:p>
+      <w:pPr>
+        <w:pStyle w:val="Code"/>
+      </w:pPr>
+      <w:r>
+        <w:rPr>
+          <w:rFonts w:ascii="Consolas" w:hAnsi="Consolas"/>
+          <w:sz w:val="18"/>
+        </w:rPr>
+        <w:t xml:space="preserve">window. No participant minuted "move before the money market can react." **Any</w:t>
+      </w:r>
+    </w:p>
+    <w:p>
+      <w:pPr>
+        <w:pStyle w:val="Code"/>
+      </w:pPr>
+      <w:r>
+        <w:rPr>
+          <w:rFonts w:ascii="Consolas" w:hAnsi="Consolas"/>
+          <w:sz w:val="18"/>
+        </w:rPr>
+        <w:t xml:space="preserve">claim of financial *intent* invents a source that does not exist**, and this repo</w:t>
+      </w:r>
+    </w:p>
+    <w:p>
+      <w:pPr>
+        <w:pStyle w:val="Code"/>
+      </w:pPr>
+      <w:r>
+        <w:rPr>
+          <w:rFonts w:ascii="Consolas" w:hAnsi="Consolas"/>
+          <w:sz w:val="18"/>
+        </w:rPr>
+        <w:t xml:space="preserve">should not make it.</w:t>
+      </w:r>
+    </w:p>
+    <w:p>
+      <w:pPr>
+        <w:pStyle w:val="Code"/>
+      </w:pPr>
+      <w:r>
+        <w:rPr>
+          <w:rFonts w:ascii="Consolas" w:hAnsi="Consolas"/>
+          <w:sz w:val="18"/>
+        </w:rPr>
+        <w:t xml:space="preserve"> </w:t>
+      </w:r>
+    </w:p>
+    <w:p>
+      <w:pPr>
+        <w:pStyle w:val="Code"/>
+      </w:pPr>
+      <w:r>
+        <w:rPr>
+          <w:rFonts w:ascii="Consolas" w:hAnsi="Consolas"/>
+          <w:sz w:val="18"/>
+        </w:rPr>
+        <w:t xml:space="preserve">The defensible claim is the stronger one. The secrecy and speed were chosen for</w:t>
+      </w:r>
+    </w:p>
+    <w:p>
+      <w:pPr>
+        <w:pStyle w:val="Code"/>
+      </w:pPr>
+      <w:r>
+        <w:rPr>
+          <w:rFonts w:ascii="Consolas" w:hAnsi="Consolas"/>
+          <w:sz w:val="18"/>
+        </w:rPr>
+        <w:t xml:space="preserve">diplomatic ends and *had* a financial **effect**: the market could not price what</w:t>
+      </w:r>
+    </w:p>
+    <w:p>
+      <w:pPr>
+        <w:pStyle w:val="Code"/>
+      </w:pPr>
+      <w:r>
+        <w:rPr>
+          <w:rFonts w:ascii="Consolas" w:hAnsi="Consolas"/>
+          <w:sz w:val="18"/>
+        </w:rPr>
+        <w:t xml:space="preserve">it could not see (the money-market and bond evidence in `war_premia` shows it saw</w:t>
+      </w:r>
+    </w:p>
+    <w:p>
+      <w:pPr>
+        <w:pStyle w:val="Code"/>
+      </w:pPr>
+      <w:r>
+        <w:rPr>
+          <w:rFonts w:ascii="Consolas" w:hAnsi="Consolas"/>
+          <w:sz w:val="18"/>
+        </w:rPr>
+        <w:t xml:space="preserve">nothing until the last week of July, then seized). A restraining financial</w:t>
+      </w:r>
+    </w:p>
+    <w:p>
+      <w:pPr>
+        <w:pStyle w:val="Code"/>
+      </w:pPr>
+      <w:r>
+        <w:rPr>
+          <w:rFonts w:ascii="Consolas" w:hAnsi="Consolas"/>
+          <w:sz w:val="18"/>
+        </w:rPr>
+        <w:t xml:space="preserve">reaction, if one would have formed, was never given time to form. **Mechanism does</w:t>
+      </w:r>
+    </w:p>
+    <w:p>
+      <w:pPr>
+        <w:pStyle w:val="Code"/>
+      </w:pPr>
+      <w:r>
+        <w:rPr>
+          <w:rFonts w:ascii="Consolas" w:hAnsi="Consolas"/>
+          <w:sz w:val="18"/>
+        </w:rPr>
+        <w:t xml:space="preserve">not require intent.** Where this repo uses the word "brake" (`crisis_lag`), read it</w:t>
+      </w:r>
+    </w:p>
+    <w:p>
+      <w:pPr>
+        <w:pStyle w:val="Code"/>
+      </w:pPr>
+      <w:r>
+        <w:rPr>
+          <w:rFonts w:ascii="Consolas" w:hAnsi="Consolas"/>
+          <w:sz w:val="18"/>
+        </w:rPr>
+        <w:t xml:space="preserve">as a statement about the *market's* capacity to react in time, never as a claim</w:t>
+      </w:r>
+    </w:p>
+    <w:p>
+      <w:pPr>
+        <w:pStyle w:val="Code"/>
+      </w:pPr>
+      <w:r>
+        <w:rPr>
+          <w:rFonts w:ascii="Consolas" w:hAnsi="Consolas"/>
+          <w:sz w:val="18"/>
+        </w:rPr>
+        <w:t xml:space="preserve">that anyone timed the crisis to defeat it.</w:t>
+      </w:r>
+    </w:p>
+    <w:p>
+      <w:pPr>
+        <w:pStyle w:val="Code"/>
+      </w:pPr>
+      <w:r>
+        <w:rPr>
+          <w:rFonts w:ascii="Consolas" w:hAnsi="Consolas"/>
+          <w:sz w:val="18"/>
+        </w:rPr>
+        <w:t xml:space="preserve"> </w:t>
+      </w:r>
+    </w:p>
+    <w:p>
+      <w:pPr>
+        <w:pStyle w:val="Code"/>
+      </w:pPr>
+      <w:r>
+        <w:rPr>
+          <w:rFonts w:ascii="Consolas" w:hAnsi="Consolas"/>
+          <w:sz w:val="18"/>
+        </w:rPr>
+        <w:t xml:space="preserve">What the market-side evidence here establishes: markets were surprised and</w:t>
+      </w:r>
+    </w:p>
+    <w:p>
+      <w:pPr>
+        <w:pStyle w:val="Code"/>
+      </w:pPr>
+      <w:r>
+        <w:rPr>
+          <w:rFonts w:ascii="Consolas" w:hAnsi="Consolas"/>
+          <w:sz w:val="18"/>
+        </w:rPr>
+        <w:t xml:space="preserve">repriced too late to matter. What it says about the *state's* knowledge or intent:</w:t>
+      </w:r>
+    </w:p>
+    <w:p>
+      <w:pPr>
+        <w:pStyle w:val="Code"/>
+      </w:pPr>
+      <w:r>
+        <w:rPr>
+          <w:rFonts w:ascii="Consolas" w:hAnsi="Consolas"/>
+          <w:sz w:val="18"/>
+        </w:rPr>
+        <w:t xml:space="preserve">**nothing.** That is a separate, archival question.</w:t>
+      </w:r>
+    </w:p>
+    <w:p>
+      <w:pPr>
+        <w:pStyle w:val="Code"/>
+      </w:pPr>
+      <w:r>
+        <w:rPr>
+          <w:rFonts w:ascii="Consolas" w:hAnsi="Consolas"/>
+          <w:sz w:val="18"/>
+        </w:rPr>
+        <w:t xml:space="preserve"> </w:t>
+      </w:r>
+    </w:p>
+    <w:p>
+      <w:pPr>
+        <w:pStyle w:val="Code"/>
+      </w:pPr>
+      <w:r>
+        <w:rPr>
+          <w:rFonts w:ascii="Consolas" w:hAnsi="Consolas"/>
+          <w:sz w:val="18"/>
+        </w:rPr>
+        <w:t xml:space="preserve">&gt; **The parallel across the earlier crises — cause or cover?** The same</w:t>
+      </w:r>
+    </w:p>
+    <w:p>
+      <w:pPr>
+        <w:pStyle w:val="Code"/>
+      </w:pPr>
+      <w:r>
+        <w:rPr>
+          <w:rFonts w:ascii="Consolas" w:hAnsi="Consolas"/>
+          <w:sz w:val="18"/>
+        </w:rPr>
+        <w:t xml:space="preserve">&gt; intent-vs-mechanism split applies to Rouvier (1905), Kokovtsov (1908–09) and</w:t>
+      </w:r>
+    </w:p>
+    <w:p>
+      <w:pPr>
+        <w:pStyle w:val="Code"/>
+      </w:pPr>
+      <w:r>
+        <w:rPr>
+          <w:rFonts w:ascii="Consolas" w:hAnsi="Consolas"/>
+          <w:sz w:val="18"/>
+        </w:rPr>
+        <w:t xml:space="preserve">&gt; Biliński (1912–13): were their *fiscal* justifications the cause of each</w:t>
+      </w:r>
+    </w:p>
+    <w:p>
+      <w:pPr>
+        <w:pStyle w:val="Code"/>
+      </w:pPr>
+      <w:r>
+        <w:rPr>
+          <w:rFonts w:ascii="Consolas" w:hAnsi="Consolas"/>
+          <w:sz w:val="18"/>
+        </w:rPr>
+        <w:t xml:space="preserve">&gt; climb-down, or cover for a decision taken on other grounds? Market data cannot</w:t>
+      </w:r>
+    </w:p>
+    <w:p>
+      <w:pPr>
+        <w:pStyle w:val="Code"/>
+      </w:pPr>
+      <w:r>
+        <w:rPr>
+          <w:rFonts w:ascii="Consolas" w:hAnsi="Consolas"/>
+          <w:sz w:val="18"/>
+        </w:rPr>
+        <w:t xml:space="preserve">&gt; settle that either — but it gives one asymmetric, timing-based handle, run in</w:t>
+      </w:r>
+    </w:p>
+    <w:p>
+      <w:pPr>
+        <w:pStyle w:val="Code"/>
+      </w:pPr>
+      <w:r>
+        <w:rPr>
+          <w:rFonts w:ascii="Consolas" w:hAnsi="Consolas"/>
+          <w:sz w:val="18"/>
+        </w:rPr>
+        <w:t xml:space="preserve">&gt; [`../crisis_lag/results/cause_or_cover.md`](../crisis_lag/results/cause_or_cover.md).</w:t>
+      </w:r>
+    </w:p>
+    <w:p>
+      <w:pPr>
+        <w:pStyle w:val="Code"/>
+      </w:pPr>
+      <w:r>
+        <w:rPr>
+          <w:rFonts w:ascii="Consolas" w:hAnsi="Consolas"/>
+          <w:sz w:val="18"/>
+        </w:rPr>
+        <w:t xml:space="preserve">&gt; Properly controlled — benchmarked against a **neutral** creditor (the Dutch</w:t>
+      </w:r>
+    </w:p>
+    <w:p>
+      <w:pPr>
+        <w:pStyle w:val="Code"/>
+      </w:pPr>
+      <w:r>
+        <w:rPr>
+          <w:rFonts w:ascii="Consolas" w:hAnsi="Consolas"/>
+          <w:sz w:val="18"/>
+        </w:rPr>
+        <w:t xml:space="preserve">&gt; yield), measured as a **change**, against a **null distribution** — each power</w:t>
+      </w:r>
+    </w:p>
+    <w:p>
+      <w:pPr>
+        <w:pStyle w:val="Code"/>
+      </w:pPr>
+      <w:r>
+        <w:rPr>
+          <w:rFonts w:ascii="Consolas" w:hAnsi="Consolas"/>
+          <w:sz w:val="18"/>
+        </w:rPr>
+        <w:t xml:space="preserve">&gt; whose own solvency was in question shows an abnormal rise in its bonds during</w:t>
+      </w:r>
+    </w:p>
+    <w:p>
+      <w:pPr>
+        <w:pStyle w:val="Code"/>
+      </w:pPr>
+      <w:r>
+        <w:rPr>
+          <w:rFonts w:ascii="Consolas" w:hAnsi="Consolas"/>
+          <w:sz w:val="18"/>
+        </w:rPr>
+        <w:t xml:space="preserve">&gt; its crisis: **Germany** (Agadir, ~90th percentile), **Russia** (Bosnia, ~80th),</w:t>
+      </w:r>
+    </w:p>
+    <w:p>
+      <w:pPr>
+        <w:pStyle w:val="Code"/>
+      </w:pPr>
+      <w:r>
+        <w:rPr>
+          <w:rFonts w:ascii="Consolas" w:hAnsi="Consolas"/>
+          <w:sz w:val="18"/>
+        </w:rPr>
+        <w:t xml:space="preserve">&gt; **Austria** (Balkans, ~90th but only at the long horizon its two-winter war</w:t>
+      </w:r>
+    </w:p>
+    <w:p>
+      <w:pPr>
+        <w:pStyle w:val="Code"/>
+      </w:pPr>
+      <w:r>
+        <w:rPr>
+          <w:rFonts w:ascii="Consolas" w:hAnsi="Consolas"/>
+          <w:sz w:val="18"/>
+        </w:rPr>
+        <w:t xml:space="preserve">&gt; needed). **France (Morocco) shows none** — the creditor power, no own-market</w:t>
+      </w:r>
+    </w:p>
+    <w:p>
+      <w:pPr>
+        <w:pStyle w:val="Code"/>
+      </w:pPr>
+      <w:r>
+        <w:rPr>
+          <w:rFonts w:ascii="Consolas" w:hAnsi="Consolas"/>
+          <w:sz w:val="18"/>
+        </w:rPr>
+        <w:t xml:space="preserve">&gt; stress, consistent with the constraint lying in Russia's collapse, not French</w:t>
+      </w:r>
+    </w:p>
+    <w:p>
+      <w:pPr>
+        <w:pStyle w:val="Code"/>
+      </w:pPr>
+      <w:r>
+        <w:rPr>
+          <w:rFonts w:ascii="Consolas" w:hAnsi="Consolas"/>
+          <w:sz w:val="18"/>
+        </w:rPr>
+        <w:t xml:space="preserve">&gt; finances. So the timing evidence *is* consistent with finance-as-constraint for</w:t>
+      </w:r>
+    </w:p>
+    <w:p>
+      <w:pPr>
+        <w:pStyle w:val="Code"/>
+      </w:pPr>
+      <w:r>
+        <w:rPr>
+          <w:rFonts w:ascii="Consolas" w:hAnsi="Consolas"/>
+          <w:sz w:val="18"/>
+        </w:rPr>
+        <w:t xml:space="preserve">&gt; three of four (a crude level check first understated this, then I over-corrected</w:t>
+      </w:r>
+    </w:p>
+    <w:p>
+      <w:pPr>
+        <w:pStyle w:val="Code"/>
+      </w:pPr>
+      <w:r>
+        <w:rPr>
+          <w:rFonts w:ascii="Consolas" w:hAnsi="Consolas"/>
+          <w:sz w:val="18"/>
+        </w:rPr>
+        <w:t xml:space="preserve">&gt; to "artifact" — the neutral-benchmark control corrects both). Still consistency,</w:t>
+      </w:r>
+    </w:p>
+    <w:p>
+      <w:pPr>
+        <w:pStyle w:val="Code"/>
+      </w:pPr>
+      <w:r>
+        <w:rPr>
+          <w:rFonts w:ascii="Consolas" w:hAnsi="Consolas"/>
+          <w:sz w:val="18"/>
+        </w:rPr>
+        <w:t xml:space="preserve">&gt; never proof; intent still needs the archives named there, and France stays the</w:t>
+      </w:r>
+    </w:p>
+    <w:p>
+      <w:pPr>
+        <w:pStyle w:val="Code"/>
+      </w:pPr>
+      <w:r>
+        <w:rPr>
+          <w:rFonts w:ascii="Consolas" w:hAnsi="Consolas"/>
+          <w:sz w:val="18"/>
+        </w:rPr>
+        <w:t xml:space="preserve">&gt; case where the objection is most alive.</w:t>
+      </w:r>
+    </w:p>
+    <w:p>
+      <w:pPr>
+        <w:pStyle w:val="Code"/>
+      </w:pPr>
+      <w:r>
+        <w:rPr>
+          <w:rFonts w:ascii="Consolas" w:hAnsi="Consolas"/>
+          <w:sz w:val="18"/>
+        </w:rPr>
+        <w:t xml:space="preserve"> </w:t>
+      </w:r>
+    </w:p>
+    <w:p>
+      <w:pPr>
+        <w:pStyle w:val="Code"/>
+      </w:pPr>
+      <w:r>
+        <w:rPr>
+          <w:rFonts w:ascii="Consolas" w:hAnsi="Consolas"/>
+          <w:sz w:val="18"/>
+        </w:rPr>
+        <w:t xml:space="preserve">##### The finite question</w:t>
+      </w:r>
+    </w:p>
+    <w:p>
+      <w:pPr>
+        <w:pStyle w:val="Code"/>
+      </w:pPr>
+      <w:r>
+        <w:rPr>
+          <w:rFonts w:ascii="Consolas" w:hAnsi="Consolas"/>
+          <w:sz w:val="18"/>
+        </w:rPr>
+        <w:t xml:space="preserve"> </w:t>
+      </w:r>
+    </w:p>
+    <w:p>
+      <w:pPr>
+        <w:pStyle w:val="Code"/>
+      </w:pPr>
+      <w:r>
+        <w:rPr>
+          <w:rFonts w:ascii="Consolas" w:hAnsi="Consolas"/>
+          <w:sz w:val="18"/>
+        </w:rPr>
+        <w:t xml:space="preserve">Did the Reichsbank or the Reich Treasury (Reichsschatzamt) take a **concrete</w:t>
+      </w:r>
+    </w:p>
+    <w:p>
+      <w:pPr>
+        <w:pStyle w:val="Code"/>
+      </w:pPr>
+      <w:r>
+        <w:rPr>
+          <w:rFonts w:ascii="Consolas" w:hAnsi="Consolas"/>
+          <w:sz w:val="18"/>
+        </w:rPr>
+        <w:t xml:space="preserve">preparatory financial step during 5–23 July 1914** — after the "blank cheque"</w:t>
+      </w:r>
+    </w:p>
+    <w:p>
+      <w:pPr>
+        <w:pStyle w:val="Code"/>
+      </w:pPr>
+      <w:r>
+        <w:rPr>
+          <w:rFonts w:ascii="Consolas" w:hAnsi="Consolas"/>
+          <w:sz w:val="18"/>
+        </w:rPr>
+        <w:t xml:space="preserve">(5–6 July), before the Austrian ultimatum (23 July) — *while the market was still</w:t>
+      </w:r>
+    </w:p>
+    <w:p>
+      <w:pPr>
+        <w:pStyle w:val="Code"/>
+      </w:pPr>
+      <w:r>
+        <w:rPr>
+          <w:rFonts w:ascii="Consolas" w:hAnsi="Consolas"/>
+          <w:sz w:val="18"/>
+        </w:rPr>
+        <w:t xml:space="preserve">calm*?</w:t>
+      </w:r>
+    </w:p>
+    <w:p>
+      <w:pPr>
+        <w:pStyle w:val="Code"/>
+      </w:pPr>
+      <w:r>
+        <w:rPr>
+          <w:rFonts w:ascii="Consolas" w:hAnsi="Consolas"/>
+          <w:sz w:val="18"/>
+        </w:rPr>
+        <w:t xml:space="preserve"> </w:t>
+      </w:r>
+    </w:p>
+    <w:p>
+      <w:pPr>
+        <w:pStyle w:val="Code"/>
+      </w:pPr>
+      <w:r>
+        <w:rPr>
+          <w:rFonts w:ascii="Consolas" w:hAnsi="Consolas"/>
+          <w:sz w:val="18"/>
+        </w:rPr>
+        <w:t xml:space="preserve">- **If yes**, the state acted on knowledge the market lacked: an information</w:t>
+      </w:r>
+    </w:p>
+    <w:p>
+      <w:pPr>
+        <w:pStyle w:val="Code"/>
+      </w:pPr>
+      <w:r>
+        <w:rPr>
+          <w:rFonts w:ascii="Consolas" w:hAnsi="Consolas"/>
+          <w:sz w:val="18"/>
+        </w:rPr>
+        <w:t xml:space="preserve">  asymmetry, the sharpest form of the mechanism. (Still not "intent to outrun the</w:t>
+      </w:r>
+    </w:p>
+    <w:p>
+      <w:pPr>
+        <w:pStyle w:val="Code"/>
+      </w:pPr>
+      <w:r>
+        <w:rPr>
+          <w:rFonts w:ascii="Consolas" w:hAnsi="Consolas"/>
+          <w:sz w:val="18"/>
+        </w:rPr>
+        <w:t xml:space="preserve">  bourse" — it could be prudent contingency — but a state moving ahead of the</w:t>
+      </w:r>
+    </w:p>
+    <w:p>
+      <w:pPr>
+        <w:pStyle w:val="Code"/>
+      </w:pPr>
+      <w:r>
+        <w:rPr>
+          <w:rFonts w:ascii="Consolas" w:hAnsi="Consolas"/>
+          <w:sz w:val="18"/>
+        </w:rPr>
+        <w:t xml:space="preserve">  market is the closest thing to a smoking gun.)</w:t>
+      </w:r>
+    </w:p>
+    <w:p>
+      <w:pPr>
+        <w:pStyle w:val="Code"/>
+      </w:pPr>
+      <w:r>
+        <w:rPr>
+          <w:rFonts w:ascii="Consolas" w:hAnsi="Consolas"/>
+          <w:sz w:val="18"/>
+        </w:rPr>
+        <w:t xml:space="preserve">- **If no** — if the Treasury, like the market, was quiet until the ultimatum —</w:t>
+      </w:r>
+    </w:p>
+    <w:p>
+      <w:pPr>
+        <w:pStyle w:val="Code"/>
+      </w:pPr>
+      <w:r>
+        <w:rPr>
+          <w:rFonts w:ascii="Consolas" w:hAnsi="Consolas"/>
+          <w:sz w:val="18"/>
+        </w:rPr>
+        <w:t xml:space="preserve">  the asymmetric-information version is *refuted*: the state was as surprised by</w:t>
+      </w:r>
+    </w:p>
+    <w:p>
+      <w:pPr>
+        <w:pStyle w:val="Code"/>
+      </w:pPr>
+      <w:r>
+        <w:rPr>
+          <w:rFonts w:ascii="Consolas" w:hAnsi="Consolas"/>
+          <w:sz w:val="18"/>
+        </w:rPr>
+        <w:t xml:space="preserve">  the tempo as the market, and the mechanism reduces to "the market could not</w:t>
+      </w:r>
+    </w:p>
+    <w:p>
+      <w:pPr>
+        <w:pStyle w:val="Code"/>
+      </w:pPr>
+      <w:r>
+        <w:rPr>
+          <w:rFonts w:ascii="Consolas" w:hAnsi="Consolas"/>
+          <w:sz w:val="18"/>
+        </w:rPr>
+        <w:t xml:space="preserve">  react in time," with no privileged state foresight.</w:t>
+      </w:r>
+    </w:p>
+    <w:p>
+      <w:pPr>
+        <w:pStyle w:val="Code"/>
+      </w:pPr>
+      <w:r>
+        <w:rPr>
+          <w:rFonts w:ascii="Consolas" w:hAnsi="Consolas"/>
+          <w:sz w:val="18"/>
+        </w:rPr>
+        <w:t xml:space="preserve"> </w:t>
+      </w:r>
+    </w:p>
+    <w:p>
+      <w:pPr>
+        <w:pStyle w:val="Code"/>
+      </w:pPr>
+      <w:r>
+        <w:rPr>
+          <w:rFonts w:ascii="Consolas" w:hAnsi="Consolas"/>
+          <w:sz w:val="18"/>
+        </w:rPr>
+        <w:t xml:space="preserve">It is a binary question with a findable answer.</w:t>
+      </w:r>
+    </w:p>
+    <w:p>
+      <w:pPr>
+        <w:pStyle w:val="Code"/>
+      </w:pPr>
+      <w:r>
+        <w:rPr>
+          <w:rFonts w:ascii="Consolas" w:hAnsi="Consolas"/>
+          <w:sz w:val="18"/>
+        </w:rPr>
+        <w:t xml:space="preserve"> </w:t>
+      </w:r>
+    </w:p>
+    <w:p>
+      <w:pPr>
+        <w:pStyle w:val="Code"/>
+      </w:pPr>
+      <w:r>
+        <w:rPr>
+          <w:rFonts w:ascii="Consolas" w:hAnsi="Consolas"/>
+          <w:sz w:val="18"/>
+        </w:rPr>
+        <w:t xml:space="preserve">##### The two sources that settle it</w:t>
+      </w:r>
+    </w:p>
+    <w:p>
+      <w:pPr>
+        <w:pStyle w:val="Code"/>
+      </w:pPr>
+      <w:r>
+        <w:rPr>
+          <w:rFonts w:ascii="Consolas" w:hAnsi="Consolas"/>
+          <w:sz w:val="18"/>
+        </w:rPr>
+        <w:t xml:space="preserve"> </w:t>
+      </w:r>
+    </w:p>
+    <w:p>
+      <w:pPr>
+        <w:pStyle w:val="Code"/>
+      </w:pPr>
+      <w:r>
+        <w:rPr>
+          <w:rFonts w:ascii="Consolas" w:hAnsi="Consolas"/>
+          <w:sz w:val="18"/>
+        </w:rPr>
+        <w:t xml:space="preserve">- **Reinhold Zilch, *Die Reichsbank und die finanzielle Kriegsvorbereitung von</w:t>
+      </w:r>
+    </w:p>
+    <w:p>
+      <w:pPr>
+        <w:pStyle w:val="Code"/>
+      </w:pPr>
+      <w:r>
+        <w:rPr>
+          <w:rFonts w:ascii="Consolas" w:hAnsi="Consolas"/>
+          <w:sz w:val="18"/>
+        </w:rPr>
+        <w:t xml:space="preserve">  1907 bis 1914*** (diss. 1976; Forschungen zur Wirtschaftsgeschichte, Berlin</w:t>
+      </w:r>
+    </w:p>
+    <w:p>
+      <w:pPr>
+        <w:pStyle w:val="Code"/>
+      </w:pPr>
+      <w:r>
+        <w:rPr>
+          <w:rFonts w:ascii="Consolas" w:hAnsi="Consolas"/>
+          <w:sz w:val="18"/>
+        </w:rPr>
+        <w:t xml:space="preserve">  1987) — *the* archival monograph on Reichsbank financial war preparation, built</w:t>
+      </w:r>
+    </w:p>
+    <w:p>
+      <w:pPr>
+        <w:pStyle w:val="Code"/>
+      </w:pPr>
+      <w:r>
+        <w:rPr>
+          <w:rFonts w:ascii="Consolas" w:hAnsi="Consolas"/>
+          <w:sz w:val="18"/>
+        </w:rPr>
+        <w:t xml:space="preserve">  on the Reichsbank and Treasury records. It is what would confirm or deny a</w:t>
+      </w:r>
+    </w:p>
+    <w:p>
+      <w:pPr>
+        <w:pStyle w:val="Code"/>
+      </w:pPr>
+      <w:r>
+        <w:rPr>
+          <w:rFonts w:ascii="Consolas" w:hAnsi="Consolas"/>
+          <w:sz w:val="18"/>
+        </w:rPr>
+        <w:t xml:space="preserve">  quiet-weeks step.</w:t>
+      </w:r>
+    </w:p>
+    <w:p>
+      <w:pPr>
+        <w:pStyle w:val="Code"/>
+      </w:pPr>
+      <w:r>
+        <w:rPr>
+          <w:rFonts w:ascii="Consolas" w:hAnsi="Consolas"/>
+          <w:sz w:val="18"/>
+        </w:rPr>
+        <w:t xml:space="preserve">- **The Reichsbank's own 1914 *Verwaltungsbericht*** — a day-by-day account of the</w:t>
+      </w:r>
+    </w:p>
+    <w:p>
+      <w:pPr>
+        <w:pStyle w:val="Code"/>
+      </w:pPr>
+      <w:r>
+        <w:rPr>
+          <w:rFonts w:ascii="Consolas" w:hAnsi="Consolas"/>
+          <w:sz w:val="18"/>
+        </w:rPr>
+        <w:t xml:space="preserve">  bank's 1914 operations (discount policy, gold movements, note issue). The</w:t>
+      </w:r>
+    </w:p>
+    <w:p>
+      <w:pPr>
+        <w:pStyle w:val="Code"/>
+      </w:pPr>
+      <w:r>
+        <w:rPr>
+          <w:rFonts w:ascii="Consolas" w:hAnsi="Consolas"/>
+          <w:sz w:val="18"/>
+        </w:rPr>
+        <w:t xml:space="preserve">  primary public record of *when* the Reichsbank actually moved.</w:t>
+      </w:r>
+    </w:p>
+    <w:p>
+      <w:pPr>
+        <w:pStyle w:val="Code"/>
+      </w:pPr>
+      <w:r>
+        <w:rPr>
+          <w:rFonts w:ascii="Consolas" w:hAnsi="Consolas"/>
+          <w:sz w:val="18"/>
+        </w:rPr>
+        <w:t xml:space="preserve"> </w:t>
+      </w:r>
+    </w:p>
+    <w:p>
+      <w:pPr>
+        <w:pStyle w:val="Code"/>
+      </w:pPr>
+      <w:r>
+        <w:rPr>
+          <w:rFonts w:ascii="Consolas" w:hAnsi="Consolas"/>
+          <w:sz w:val="18"/>
+        </w:rPr>
+        <w:t xml:space="preserve">###### Where they're digitized (access map)</w:t>
+      </w:r>
+    </w:p>
+    <w:p>
+      <w:pPr>
+        <w:pStyle w:val="Code"/>
+      </w:pPr>
+      <w:r>
+        <w:rPr>
+          <w:rFonts w:ascii="Consolas" w:hAnsi="Consolas"/>
+          <w:sz w:val="18"/>
+        </w:rPr>
+        <w:t xml:space="preserve"> </w:t>
+      </w:r>
+    </w:p>
+    <w:p>
+      <w:pPr>
+        <w:pStyle w:val="Code"/>
+      </w:pPr>
+      <w:r>
+        <w:rPr>
+          <w:rFonts w:ascii="Consolas" w:hAnsi="Consolas"/>
+          <w:sz w:val="18"/>
+        </w:rPr>
+        <w:t xml:space="preserve">Searched Aug 2026. Both are *located*; neither could be pulled from this</w:t>
+      </w:r>
+    </w:p>
+    <w:p>
+      <w:pPr>
+        <w:pStyle w:val="Code"/>
+      </w:pPr>
+      <w:r>
+        <w:rPr>
+          <w:rFonts w:ascii="Consolas" w:hAnsi="Consolas"/>
+          <w:sz w:val="18"/>
+        </w:rPr>
+        <w:t xml:space="preserve">repo's locked-down environment (curl-with-CA egress only — no browser that can</w:t>
+      </w:r>
+    </w:p>
+    <w:p>
+      <w:pPr>
+        <w:pStyle w:val="Code"/>
+      </w:pPr>
+      <w:r>
+        <w:rPr>
+          <w:rFonts w:ascii="Consolas" w:hAnsi="Consolas"/>
+          <w:sz w:val="18"/>
+        </w:rPr>
+        <w:t xml:space="preserve">tunnel the agent proxy, Google Books API rate-limited, and every delivery</w:t>
+      </w:r>
+    </w:p>
+    <w:p>
+      <w:pPr>
+        <w:pStyle w:val="Code"/>
+      </w:pPr>
+      <w:r>
+        <w:rPr>
+          <w:rFonts w:ascii="Consolas" w:hAnsi="Consolas"/>
+          <w:sz w:val="18"/>
+        </w:rPr>
+        <w:t xml:space="preserve">surface below is a JavaScript viewer or Cloudflare-gated). On an unrestricted</w:t>
+      </w:r>
+    </w:p>
+    <w:p>
+      <w:pPr>
+        <w:pStyle w:val="Code"/>
+      </w:pPr>
+      <w:r>
+        <w:rPr>
+          <w:rFonts w:ascii="Consolas" w:hAnsi="Consolas"/>
+          <w:sz w:val="18"/>
+        </w:rPr>
+        <w:t xml:space="preserve">network the public-domain report opens in one click at the first two.</w:t>
+      </w:r>
+    </w:p>
+    <w:p>
+      <w:pPr>
+        <w:pStyle w:val="Code"/>
+      </w:pPr>
+      <w:r>
+        <w:rPr>
+          <w:rFonts w:ascii="Consolas" w:hAnsi="Consolas"/>
+          <w:sz w:val="18"/>
+        </w:rPr>
+        <w:t xml:space="preserve"> </w:t>
+      </w:r>
+    </w:p>
+    <w:p>
+      <w:pPr>
+        <w:pStyle w:val="Code"/>
+      </w:pPr>
+      <w:r>
+        <w:rPr>
+          <w:rFonts w:ascii="Consolas" w:hAnsi="Consolas"/>
+          <w:sz w:val="18"/>
+        </w:rPr>
+        <w:t xml:space="preserve">**Reichsbank 1914 *Verwaltungsbericht* (Berlin, 1915) — public domain, digitized:**</w:t>
+      </w:r>
+    </w:p>
+    <w:p>
+      <w:pPr>
+        <w:pStyle w:val="Code"/>
+      </w:pPr>
+      <w:r>
+        <w:rPr>
+          <w:rFonts w:ascii="Consolas" w:hAnsi="Consolas"/>
+          <w:sz w:val="18"/>
+        </w:rPr>
+        <w:t xml:space="preserve">- **HathiTrust**, catalogue **Record 100598111** — the one confirmed digital</w:t>
+      </w:r>
+    </w:p>
+    <w:p>
+      <w:pPr>
+        <w:pStyle w:val="Code"/>
+      </w:pPr>
+      <w:r>
+        <w:rPr>
+          <w:rFonts w:ascii="Consolas" w:hAnsi="Consolas"/>
+          <w:sz w:val="18"/>
+        </w:rPr>
+        <w:t xml:space="preserve">  run of the *Reichsbank* Verwaltungsbericht (full-view for the pre-1929</w:t>
+      </w:r>
+    </w:p>
+    <w:p>
+      <w:pPr>
+        <w:pStyle w:val="Code"/>
+      </w:pPr>
+      <w:r>
+        <w:rPr>
+          <w:rFonts w:ascii="Consolas" w:hAnsi="Consolas"/>
+          <w:sz w:val="18"/>
+        </w:rPr>
+        <w:t xml:space="preserve">  volumes). Whether the 1914 business-year volume is among HathiTrust's held</w:t>
+      </w:r>
+    </w:p>
+    <w:p>
+      <w:pPr>
+        <w:pStyle w:val="Code"/>
+      </w:pPr>
+      <w:r>
+        <w:rPr>
+          <w:rFonts w:ascii="Consolas" w:hAnsi="Consolas"/>
+          <w:sz w:val="18"/>
+        </w:rPr>
+        <w:t xml:space="preserve">  years could not be checked here (Cloudflare bot challenge blocks the catalogue</w:t>
+      </w:r>
+    </w:p>
+    <w:p>
+      <w:pPr>
+        <w:pStyle w:val="Code"/>
+      </w:pPr>
+      <w:r>
+        <w:rPr>
+          <w:rFonts w:ascii="Consolas" w:hAnsi="Consolas"/>
+          <w:sz w:val="18"/>
+        </w:rPr>
+        <w:t xml:space="preserve">  and the API). This is the primary download route.</w:t>
+      </w:r>
+    </w:p>
+    <w:p>
+      <w:pPr>
+        <w:pStyle w:val="Code"/>
+      </w:pPr>
+      <w:r>
+        <w:rPr>
+          <w:rFonts w:ascii="Consolas" w:hAnsi="Consolas"/>
+          <w:sz w:val="18"/>
+        </w:rPr>
+        <w:t xml:space="preserve">  &lt;https://catalog.hathitrust.org/Record/100598111&gt;</w:t>
+      </w:r>
+    </w:p>
+    <w:p>
+      <w:pPr>
+        <w:pStyle w:val="Code"/>
+      </w:pPr>
+      <w:r>
+        <w:rPr>
+          <w:rFonts w:ascii="Consolas" w:hAnsi="Consolas"/>
+          <w:sz w:val="18"/>
+        </w:rPr>
+        <w:t xml:space="preserve">- **Bundesarchiv R 2501** (Reichsbank records), harvested to DDB /</w:t>
+      </w:r>
+    </w:p>
+    <w:p>
+      <w:pPr>
+        <w:pStyle w:val="Code"/>
+      </w:pPr>
+      <w:r>
+        <w:rPr>
+          <w:rFonts w:ascii="Consolas" w:hAnsi="Consolas"/>
+          <w:sz w:val="18"/>
+        </w:rPr>
+        <w:t xml:space="preserve">  Archivportal-D — but the DDB harvest of this series **skips the 1914</w:t>
+      </w:r>
+    </w:p>
+    <w:p>
+      <w:pPr>
+        <w:pStyle w:val="Code"/>
+      </w:pPr>
+      <w:r>
+        <w:rPr>
+          <w:rFonts w:ascii="Consolas" w:hAnsi="Consolas"/>
+          <w:sz w:val="18"/>
+        </w:rPr>
+        <w:t xml:space="preserve">  business year** (it carries 1889–1908 and 1919–1941 scattered, no 1914 item),</w:t>
+      </w:r>
+    </w:p>
+    <w:p>
+      <w:pPr>
+        <w:pStyle w:val="Code"/>
+      </w:pPr>
+      <w:r>
+        <w:rPr>
+          <w:rFonts w:ascii="Consolas" w:hAnsi="Consolas"/>
+          <w:sz w:val="18"/>
+        </w:rPr>
+        <w:t xml:space="preserve">  so BArch likely holds the 1914 volume un-harvested. Delivery is the invenio</w:t>
+      </w:r>
+    </w:p>
+    <w:p>
+      <w:pPr>
+        <w:pStyle w:val="Code"/>
+      </w:pPr>
+      <w:r>
+        <w:rPr>
+          <w:rFonts w:ascii="Consolas" w:hAnsi="Consolas"/>
+          <w:sz w:val="18"/>
+        </w:rPr>
+        <w:t xml:space="preserve">  session viewer.</w:t>
+      </w:r>
+    </w:p>
+    <w:p>
+      <w:pPr>
+        <w:pStyle w:val="Code"/>
+      </w:pPr>
+      <w:r>
+        <w:rPr>
+          <w:rFonts w:ascii="Consolas" w:hAnsi="Consolas"/>
+          <w:sz w:val="18"/>
+        </w:rPr>
+        <w:t xml:space="preserve">- German National Library serial record: `d-nb.info/01026602X`.</w:t>
+      </w:r>
+    </w:p>
+    <w:p>
+      <w:pPr>
+        <w:pStyle w:val="Code"/>
+      </w:pPr>
+      <w:r>
+        <w:rPr>
+          <w:rFonts w:ascii="Consolas" w:hAnsi="Consolas"/>
+          <w:sz w:val="18"/>
+        </w:rPr>
+        <w:t xml:space="preserve">- **Correction:** an MDZ / Bayerische Staatsbibliothek digitization exists at</w:t>
+      </w:r>
+    </w:p>
+    <w:p>
+      <w:pPr>
+        <w:pStyle w:val="Code"/>
+      </w:pPr>
+      <w:r>
+        <w:rPr>
+          <w:rFonts w:ascii="Consolas" w:hAnsi="Consolas"/>
+          <w:sz w:val="18"/>
+        </w:rPr>
+        <w:t xml:space="preserve">  **ZDB-ID 520775-7**, but the K10plus union catalogue attaches that link to</w:t>
+      </w:r>
+    </w:p>
+    <w:p>
+      <w:pPr>
+        <w:pStyle w:val="Code"/>
+      </w:pPr>
+      <w:r>
+        <w:rPr>
+          <w:rFonts w:ascii="Consolas" w:hAnsi="Consolas"/>
+          <w:sz w:val="18"/>
+        </w:rPr>
+        <w:t xml:space="preserve">  the *Verwaltungsbericht der **Preussischen Bank*** — the Reichsbank's pre-1876</w:t>
+      </w:r>
+    </w:p>
+    <w:p>
+      <w:pPr>
+        <w:pStyle w:val="Code"/>
+      </w:pPr>
+      <w:r>
+        <w:rPr>
+          <w:rFonts w:ascii="Consolas" w:hAnsi="Consolas"/>
+          <w:sz w:val="18"/>
+        </w:rPr>
+        <w:t xml:space="preserve">  predecessor — **not** the Reichsbank report, and it does not cover 1914. The</w:t>
+      </w:r>
+    </w:p>
+    <w:p>
+      <w:pPr>
+        <w:pStyle w:val="Code"/>
+      </w:pPr>
+      <w:r>
+        <w:rPr>
+          <w:rFonts w:ascii="Consolas" w:hAnsi="Consolas"/>
+          <w:sz w:val="18"/>
+        </w:rPr>
+        <w:t xml:space="preserve">  three Reichsbank Verwaltungsbericht records in K10plus carry no digitization</w:t>
+      </w:r>
+    </w:p>
+    <w:p>
+      <w:pPr>
+        <w:pStyle w:val="Code"/>
+      </w:pPr>
+      <w:r>
+        <w:rPr>
+          <w:rFonts w:ascii="Consolas" w:hAnsi="Consolas"/>
+          <w:sz w:val="18"/>
+        </w:rPr>
+        <w:t xml:space="preserve">  link at all. Do not cite MDZ for the 1914 Reichsbank report.</w:t>
+      </w:r>
+    </w:p>
+    <w:p>
+      <w:pPr>
+        <w:pStyle w:val="Code"/>
+      </w:pPr>
+      <w:r>
+        <w:rPr>
+          <w:rFonts w:ascii="Consolas" w:hAnsi="Consolas"/>
+          <w:sz w:val="18"/>
+        </w:rPr>
+        <w:t xml:space="preserve"> </w:t>
+      </w:r>
+    </w:p>
+    <w:p>
+      <w:pPr>
+        <w:pStyle w:val="Code"/>
+      </w:pPr>
+      <w:r>
+        <w:rPr>
+          <w:rFonts w:ascii="Consolas" w:hAnsi="Consolas"/>
+          <w:sz w:val="18"/>
+        </w:rPr>
+        <w:t xml:space="preserve">**Zilch (1987) — in copyright, no open-access full text.** The Akademie-Verlag</w:t>
+      </w:r>
+    </w:p>
+    <w:p>
+      <w:pPr>
+        <w:pStyle w:val="Code"/>
+      </w:pPr>
+      <w:r>
+        <w:rPr>
+          <w:rFonts w:ascii="Consolas" w:hAnsi="Consolas"/>
+          <w:sz w:val="18"/>
+        </w:rPr>
+        <w:t xml:space="preserve">original (Forschungen zur Wirtschaftsgeschichte Bd. 20, from the 1976</w:t>
+      </w:r>
+    </w:p>
+    <w:p>
+      <w:pPr>
+        <w:pStyle w:val="Code"/>
+      </w:pPr>
+      <w:r>
+        <w:rPr>
+          <w:rFonts w:ascii="Consolas" w:hAnsi="Consolas"/>
+          <w:sz w:val="18"/>
+        </w:rPr>
+        <w:t xml:space="preserve">dissertation) was reissued by De Gruyter in 2022 (ISBN 978-3-11-277326-0) and</w:t>
+      </w:r>
+    </w:p>
+    <w:p>
+      <w:pPr>
+        <w:pStyle w:val="Code"/>
+      </w:pPr>
+      <w:r>
+        <w:rPr>
+          <w:rFonts w:ascii="Consolas" w:hAnsi="Consolas"/>
+          <w:sz w:val="18"/>
+        </w:rPr>
+        <w:t xml:space="preserve">sells commercially. An interlibrary-loan / purchase item, held at major</w:t>
+      </w:r>
+    </w:p>
+    <w:p>
+      <w:pPr>
+        <w:pStyle w:val="Code"/>
+      </w:pPr>
+      <w:r>
+        <w:rPr>
+          <w:rFonts w:ascii="Consolas" w:hAnsi="Consolas"/>
+          <w:sz w:val="18"/>
+        </w:rPr>
+        <w:t xml:space="preserve">research libraries; not a free download. (DigiZeitschriften, one possible</w:t>
+      </w:r>
+    </w:p>
+    <w:p>
+      <w:pPr>
+        <w:pStyle w:val="Code"/>
+      </w:pPr>
+      <w:r>
+        <w:rPr>
+          <w:rFonts w:ascii="Consolas" w:hAnsi="Consolas"/>
+          <w:sz w:val="18"/>
+        </w:rPr>
+        <w:t xml:space="preserve">route, was discontinued 31 Dec 2025.)</w:t>
+      </w:r>
+    </w:p>
+    <w:p>
+      <w:pPr>
+        <w:pStyle w:val="Code"/>
+      </w:pPr>
+      <w:r>
+        <w:rPr>
+          <w:rFonts w:ascii="Consolas" w:hAnsi="Consolas"/>
+          <w:sz w:val="18"/>
+        </w:rPr>
+        <w:t xml:space="preserve"> </w:t>
+      </w:r>
+    </w:p>
+    <w:p>
+      <w:pPr>
+        <w:pStyle w:val="Code"/>
+      </w:pPr>
+      <w:r>
+        <w:rPr>
+          <w:rFonts w:ascii="Consolas" w:hAnsi="Consolas"/>
+          <w:sz w:val="18"/>
+        </w:rPr>
+        <w:t xml:space="preserve">##### Evidence state (audited against the scholarship that cites Zilch and BArch R 2)</w:t>
+      </w:r>
+    </w:p>
+    <w:p>
+      <w:pPr>
+        <w:pStyle w:val="Code"/>
+      </w:pPr>
+      <w:r>
+        <w:rPr>
+          <w:rFonts w:ascii="Consolas" w:hAnsi="Consolas"/>
+          <w:sz w:val="18"/>
+        </w:rPr>
+        <w:t xml:space="preserve"> </w:t>
+      </w:r>
+    </w:p>
+    <w:p>
+      <w:pPr>
+        <w:pStyle w:val="Code"/>
+      </w:pPr>
+      <w:r>
+        <w:rPr>
+          <w:rFonts w:ascii="Consolas" w:hAnsi="Consolas"/>
+          <w:sz w:val="18"/>
+        </w:rPr>
+        <w:t xml:space="preserve">**Established (documented):**</w:t>
+      </w:r>
+    </w:p>
+    <w:p>
+      <w:pPr>
+        <w:pStyle w:val="Code"/>
+      </w:pPr>
+      <w:r>
+        <w:rPr>
+          <w:rFonts w:ascii="Consolas" w:hAnsi="Consolas"/>
+          <w:sz w:val="18"/>
+        </w:rPr>
+        <w:t xml:space="preserve">- The financial-mobilization **framework is old — 1891**: the Reichsbank as fiscal</w:t>
+      </w:r>
+    </w:p>
+    <w:p>
+      <w:pPr>
+        <w:pStyle w:val="Code"/>
+      </w:pPr>
+      <w:r>
+        <w:rPr>
+          <w:rFonts w:ascii="Consolas" w:hAnsi="Consolas"/>
+          <w:sz w:val="18"/>
+        </w:rPr>
+        <w:t xml:space="preserve">  agent, loan-bank (Darlehnskassen) creation, and *draft war-finance laws to be</w:t>
+      </w:r>
+    </w:p>
+    <w:p>
+      <w:pPr>
+        <w:pStyle w:val="Code"/>
+      </w:pPr>
+      <w:r>
+        <w:rPr>
+          <w:rFonts w:ascii="Consolas" w:hAnsi="Consolas"/>
+          <w:sz w:val="18"/>
+        </w:rPr>
+        <w:t xml:space="preserve">  enacted in case of war*, with "details added in later years." Refined by the</w:t>
+      </w:r>
+    </w:p>
+    <w:p>
+      <w:pPr>
+        <w:pStyle w:val="Code"/>
+      </w:pPr>
+      <w:r>
+        <w:rPr>
+          <w:rFonts w:ascii="Consolas" w:hAnsi="Consolas"/>
+          <w:sz w:val="18"/>
+        </w:rPr>
+        <w:t xml:space="preserve">  Wermuth/Havenstein gold-accumulation program to 1914. **Readiness is a 23-year</w:t>
+      </w:r>
+    </w:p>
+    <w:p>
+      <w:pPr>
+        <w:pStyle w:val="Code"/>
+      </w:pPr>
+      <w:r>
+        <w:rPr>
+          <w:rFonts w:ascii="Consolas" w:hAnsi="Consolas"/>
+          <w:sz w:val="18"/>
+        </w:rPr>
+        <w:t xml:space="preserve">  contingency plan, not a July 1914 initiative.**</w:t>
+      </w:r>
+    </w:p>
+    <w:p>
+      <w:pPr>
+        <w:pStyle w:val="Code"/>
+      </w:pPr>
+      <w:r>
+        <w:rPr>
+          <w:rFonts w:ascii="Consolas" w:hAnsi="Consolas"/>
+          <w:sz w:val="18"/>
+        </w:rPr>
+        <w:t xml:space="preserve">- Operational steps are dated to the **crisis, not the quiet weeks**: specie</w:t>
+      </w:r>
+    </w:p>
+    <w:p>
+      <w:pPr>
+        <w:pStyle w:val="Code"/>
+      </w:pPr>
+      <w:r>
+        <w:rPr>
+          <w:rFonts w:ascii="Consolas" w:hAnsi="Consolas"/>
+          <w:sz w:val="18"/>
+        </w:rPr>
+        <w:t xml:space="preserve">  payments suspended **31 July**; the imperial gold reserve (Kriegsschatz, 240 M</w:t>
+      </w:r>
+    </w:p>
+    <w:p>
+      <w:pPr>
+        <w:pStyle w:val="Code"/>
+      </w:pPr>
+      <w:r>
+        <w:rPr>
+          <w:rFonts w:ascii="Consolas" w:hAnsi="Consolas"/>
+          <w:sz w:val="18"/>
+        </w:rPr>
+        <w:t xml:space="preserve">  ℳ) transferred to the Reichsbank **2 August** (BArch **R 2/41134**); the bank</w:t>
+      </w:r>
+    </w:p>
+    <w:p>
+      <w:pPr>
+        <w:pStyle w:val="Code"/>
+      </w:pPr>
+      <w:r>
+        <w:rPr>
+          <w:rFonts w:ascii="Consolas" w:hAnsi="Consolas"/>
+          <w:sz w:val="18"/>
+        </w:rPr>
+        <w:t xml:space="preserve">  laws enacted **4 August**.</w:t>
+      </w:r>
+    </w:p>
+    <w:p>
+      <w:pPr>
+        <w:pStyle w:val="Code"/>
+      </w:pPr>
+      <w:r>
+        <w:rPr>
+          <w:rFonts w:ascii="Consolas" w:hAnsi="Consolas"/>
+          <w:sz w:val="18"/>
+        </w:rPr>
+        <w:t xml:space="preserve">- The plan was built **for a short, victorious war** ("the departure from the gold</w:t>
+      </w:r>
+    </w:p>
+    <w:p>
+      <w:pPr>
+        <w:pStyle w:val="Code"/>
+      </w:pPr>
+      <w:r>
+        <w:rPr>
+          <w:rFonts w:ascii="Consolas" w:hAnsi="Consolas"/>
+          <w:sz w:val="18"/>
+        </w:rPr>
+        <w:t xml:space="preserve">  standard was only temporary"). The state's *own* financial design shared the</w:t>
+      </w:r>
+    </w:p>
+    <w:p>
+      <w:pPr>
+        <w:pStyle w:val="Code"/>
+      </w:pPr>
+      <w:r>
+        <w:rPr>
+          <w:rFonts w:ascii="Consolas" w:hAnsi="Consolas"/>
+          <w:sz w:val="18"/>
+        </w:rPr>
+        <w:t xml:space="preserve">  short-war assumption that mispriced the actual conflict — **readiness was not</w:t>
+      </w:r>
+    </w:p>
+    <w:p>
+      <w:pPr>
+        <w:pStyle w:val="Code"/>
+      </w:pPr>
+      <w:r>
+        <w:rPr>
+          <w:rFonts w:ascii="Consolas" w:hAnsi="Consolas"/>
+          <w:sz w:val="18"/>
+        </w:rPr>
+        <w:t xml:space="preserve">  foresight.**</w:t>
+      </w:r>
+    </w:p>
+    <w:p>
+      <w:pPr>
+        <w:pStyle w:val="Code"/>
+      </w:pPr>
+      <w:r>
+        <w:rPr>
+          <w:rFonts w:ascii="Consolas" w:hAnsi="Consolas"/>
+          <w:sz w:val="18"/>
+        </w:rPr>
+        <w:t xml:space="preserve"> </w:t>
+      </w:r>
+    </w:p>
+    <w:p>
+      <w:pPr>
+        <w:pStyle w:val="Code"/>
+      </w:pPr>
+      <w:r>
+        <w:rPr>
+          <w:rFonts w:ascii="Consolas" w:hAnsi="Consolas"/>
+          <w:sz w:val="18"/>
+        </w:rPr>
+        <w:t xml:space="preserve">**Not established:**</w:t>
+      </w:r>
+    </w:p>
+    <w:p>
+      <w:pPr>
+        <w:pStyle w:val="Code"/>
+      </w:pPr>
+      <w:r>
+        <w:rPr>
+          <w:rFonts w:ascii="Consolas" w:hAnsi="Consolas"/>
+          <w:sz w:val="18"/>
+        </w:rPr>
+        <w:t xml:space="preserve">- Any concrete Reichsbank/Treasury action dated **5–23 July 1914**. The</w:t>
+      </w:r>
+    </w:p>
+    <w:p>
+      <w:pPr>
+        <w:pStyle w:val="Code"/>
+      </w:pPr>
+      <w:r>
+        <w:rPr>
+          <w:rFonts w:ascii="Consolas" w:hAnsi="Consolas"/>
+          <w:sz w:val="18"/>
+        </w:rPr>
+        <w:t xml:space="preserve">  authoritative *1914-1918-Online* synthesis — which *does* cite Zilch and even</w:t>
+      </w:r>
+    </w:p>
+    <w:p>
+      <w:pPr>
+        <w:pStyle w:val="Code"/>
+      </w:pPr>
+      <w:r>
+        <w:rPr>
+          <w:rFonts w:ascii="Consolas" w:hAnsi="Consolas"/>
+          <w:sz w:val="18"/>
+        </w:rPr>
+        <w:t xml:space="preserve">  gives BArch R 2 signatures for the August steps — reports **no** discount-rate</w:t>
+      </w:r>
+    </w:p>
+    <w:p>
+      <w:pPr>
+        <w:pStyle w:val="Code"/>
+      </w:pPr>
+      <w:r>
+        <w:rPr>
+          <w:rFonts w:ascii="Consolas" w:hAnsi="Consolas"/>
+          <w:sz w:val="18"/>
+        </w:rPr>
+        <w:t xml:space="preserve">  or gold-policy change before ~31 July, and nothing in the blank-cheque-to-</w:t>
+      </w:r>
+    </w:p>
+    <w:p>
+      <w:pPr>
+        <w:pStyle w:val="Code"/>
+      </w:pPr>
+      <w:r>
+        <w:rPr>
+          <w:rFonts w:ascii="Consolas" w:hAnsi="Consolas"/>
+          <w:sz w:val="18"/>
+        </w:rPr>
+        <w:t xml:space="preserve">  ultimatum window. The public central bank was calm because it *was* calm.</w:t>
+      </w:r>
+    </w:p>
+    <w:p>
+      <w:pPr>
+        <w:pStyle w:val="Code"/>
+      </w:pPr>
+      <w:r>
+        <w:rPr>
+          <w:rFonts w:ascii="Consolas" w:hAnsi="Consolas"/>
+          <w:sz w:val="18"/>
+        </w:rPr>
+        <w:t xml:space="preserve"> </w:t>
+      </w:r>
+    </w:p>
+    <w:p>
+      <w:pPr>
+        <w:pStyle w:val="Code"/>
+      </w:pPr>
+      <w:r>
+        <w:rPr>
+          <w:rFonts w:ascii="Consolas" w:hAnsi="Consolas"/>
+          <w:sz w:val="18"/>
+        </w:rPr>
+        <w:t xml:space="preserve">**Unreliable (do not use):**</w:t>
+      </w:r>
+    </w:p>
+    <w:p>
+      <w:pPr>
+        <w:pStyle w:val="Code"/>
+      </w:pPr>
+      <w:r>
+        <w:rPr>
+          <w:rFonts w:ascii="Consolas" w:hAnsi="Consolas"/>
+          <w:sz w:val="18"/>
+        </w:rPr>
+        <w:t xml:space="preserve">- The popular "Havenstein demanded all banks' gold on 18 June 1914" line (Mises</w:t>
+      </w:r>
+    </w:p>
+    <w:p>
+      <w:pPr>
+        <w:pStyle w:val="Code"/>
+      </w:pPr>
+      <w:r>
+        <w:rPr>
+          <w:rFonts w:ascii="Consolas" w:hAnsi="Consolas"/>
+          <w:sz w:val="18"/>
+        </w:rPr>
+        <w:t xml:space="preserve">  op-ed) — conflates the multi-year campaign and supplies the *intent* framing to</w:t>
+      </w:r>
+    </w:p>
+    <w:p>
+      <w:pPr>
+        <w:pStyle w:val="Code"/>
+      </w:pPr>
+      <w:r>
+        <w:rPr>
+          <w:rFonts w:ascii="Consolas" w:hAnsi="Consolas"/>
+          <w:sz w:val="18"/>
+        </w:rPr>
+        <w:t xml:space="preserve">  be avoided.</w:t>
+      </w:r>
+    </w:p>
+    <w:p>
+      <w:pPr>
+        <w:pStyle w:val="Code"/>
+      </w:pPr>
+      <w:r>
+        <w:rPr>
+          <w:rFonts w:ascii="Consolas" w:hAnsi="Consolas"/>
+          <w:sz w:val="18"/>
+        </w:rPr>
+        <w:t xml:space="preserve"> </w:t>
+      </w:r>
+    </w:p>
+    <w:p>
+      <w:pPr>
+        <w:pStyle w:val="Code"/>
+      </w:pPr>
+      <w:r>
+        <w:rPr>
+          <w:rFonts w:ascii="Consolas" w:hAnsi="Consolas"/>
+          <w:sz w:val="18"/>
+        </w:rPr>
+        <w:t xml:space="preserve">##### Provisional verdict — and it leans *against* the smoking gun</w:t>
+      </w:r>
+    </w:p>
+    <w:p>
+      <w:pPr>
+        <w:pStyle w:val="Code"/>
+      </w:pPr>
+      <w:r>
+        <w:rPr>
+          <w:rFonts w:ascii="Consolas" w:hAnsi="Consolas"/>
+          <w:sz w:val="18"/>
+        </w:rPr>
+        <w:t xml:space="preserve"> </w:t>
+      </w:r>
+    </w:p>
+    <w:p>
+      <w:pPr>
+        <w:pStyle w:val="Code"/>
+      </w:pPr>
+      <w:r>
+        <w:rPr>
+          <w:rFonts w:ascii="Consolas" w:hAnsi="Consolas"/>
+          <w:sz w:val="18"/>
+        </w:rPr>
+        <w:t xml:space="preserve">On the currently documented evidence, the **asymmetric-information version is not</w:t>
+      </w:r>
+    </w:p>
+    <w:p>
+      <w:pPr>
+        <w:pStyle w:val="Code"/>
+      </w:pPr>
+      <w:r>
+        <w:rPr>
+          <w:rFonts w:ascii="Consolas" w:hAnsi="Consolas"/>
+          <w:sz w:val="18"/>
+        </w:rPr>
+        <w:t xml:space="preserve">supported**: the Reichsbank did not act ahead of the market in the quiet weeks. It</w:t>
+      </w:r>
+    </w:p>
+    <w:p>
+      <w:pPr>
+        <w:pStyle w:val="Code"/>
+      </w:pPr>
+      <w:r>
+        <w:rPr>
+          <w:rFonts w:ascii="Consolas" w:hAnsi="Consolas"/>
+          <w:sz w:val="18"/>
+        </w:rPr>
+        <w:t xml:space="preserve">held a long-standing plan and *activated it at the crisis* — 31 July onward,</w:t>
+      </w:r>
+    </w:p>
+    <w:p>
+      <w:pPr>
+        <w:pStyle w:val="Code"/>
+      </w:pPr>
+      <w:r>
+        <w:rPr>
+          <w:rFonts w:ascii="Consolas" w:hAnsi="Consolas"/>
+          <w:sz w:val="18"/>
+        </w:rPr>
+        <w:t xml:space="preserve">roughly when the market itself woke up; in the last days it was even reacting to a</w:t>
+      </w:r>
+    </w:p>
+    <w:p>
+      <w:pPr>
+        <w:pStyle w:val="Code"/>
+      </w:pPr>
+      <w:r>
+        <w:rPr>
+          <w:rFonts w:ascii="Consolas" w:hAnsi="Consolas"/>
+          <w:sz w:val="18"/>
+        </w:rPr>
+        <w:t xml:space="preserve">gold run, not front-running one. So the mechanism reduces to its honest core:</w:t>
+      </w:r>
+    </w:p>
+    <w:p>
+      <w:pPr>
+        <w:pStyle w:val="Code"/>
+      </w:pPr>
+      <w:r>
+        <w:rPr>
+          <w:rFonts w:ascii="Consolas" w:hAnsi="Consolas"/>
+          <w:sz w:val="18"/>
+        </w:rPr>
+        <w:t xml:space="preserve">**the market could not react in time to a diplomatic tempo — not that the state</w:t>
+      </w:r>
+    </w:p>
+    <w:p>
+      <w:pPr>
+        <w:pStyle w:val="Code"/>
+      </w:pPr>
+      <w:r>
+        <w:rPr>
+          <w:rFonts w:ascii="Consolas" w:hAnsi="Consolas"/>
+          <w:sz w:val="18"/>
+        </w:rPr>
+        <w:t xml:space="preserve">knew and moved first.** And the sharper irony is that the state's readiness was</w:t>
+      </w:r>
+    </w:p>
+    <w:p>
+      <w:pPr>
+        <w:pStyle w:val="Code"/>
+      </w:pPr>
+      <w:r>
+        <w:rPr>
+          <w:rFonts w:ascii="Consolas" w:hAnsi="Consolas"/>
+          <w:sz w:val="18"/>
+        </w:rPr>
+        <w:t xml:space="preserve">calibrated to the *wrong* war (short, victorious), the same misjudgment the market</w:t>
+      </w:r>
+    </w:p>
+    <w:p>
+      <w:pPr>
+        <w:pStyle w:val="Code"/>
+      </w:pPr>
+      <w:r>
+        <w:rPr>
+          <w:rFonts w:ascii="Consolas" w:hAnsi="Consolas"/>
+          <w:sz w:val="18"/>
+        </w:rPr>
+        <w:t xml:space="preserve">made about pricing one at all.</w:t>
+      </w:r>
+    </w:p>
+    <w:p>
+      <w:pPr>
+        <w:pStyle w:val="Code"/>
+      </w:pPr>
+      <w:r>
+        <w:rPr>
+          <w:rFonts w:ascii="Consolas" w:hAnsi="Consolas"/>
+          <w:sz w:val="18"/>
+        </w:rPr>
+        <w:t xml:space="preserve"> </w:t>
+      </w:r>
+    </w:p>
+    <w:p>
+      <w:pPr>
+        <w:pStyle w:val="Code"/>
+      </w:pPr>
+      <w:r>
+        <w:rPr>
+          <w:rFonts w:ascii="Consolas" w:hAnsi="Consolas"/>
+          <w:sz w:val="18"/>
+        </w:rPr>
+        <w:t xml:space="preserve">This is *provisional* because it rests on the English-language synthesis of Zilch,</w:t>
+      </w:r>
+    </w:p>
+    <w:p>
+      <w:pPr>
+        <w:pStyle w:val="Code"/>
+      </w:pPr>
+      <w:r>
+        <w:rPr>
+          <w:rFonts w:ascii="Consolas" w:hAnsi="Consolas"/>
+          <w:sz w:val="18"/>
+        </w:rPr>
+        <w:t xml:space="preserve">not a line-by-line read of Zilch's German text or the 1914 *Verwaltungsbericht* —</w:t>
+      </w:r>
+    </w:p>
+    <w:p>
+      <w:pPr>
+        <w:pStyle w:val="Code"/>
+      </w:pPr>
+      <w:r>
+        <w:rPr>
+          <w:rFonts w:ascii="Consolas" w:hAnsi="Consolas"/>
+          <w:sz w:val="18"/>
+        </w:rPr>
+        <w:t xml:space="preserve">either of which could surface a finer mid-July detail. But the burden has shifted:</w:t>
+      </w:r>
+    </w:p>
+    <w:p>
+      <w:pPr>
+        <w:pStyle w:val="Code"/>
+      </w:pPr>
+      <w:r>
+        <w:rPr>
+          <w:rFonts w:ascii="Consolas" w:hAnsi="Consolas"/>
+          <w:sz w:val="18"/>
+        </w:rPr>
+        <w:t xml:space="preserve">the default reading is now **no privileged state action in the quiet weeks**, and</w:t>
+      </w:r>
+    </w:p>
+    <w:p>
+      <w:pPr>
+        <w:pStyle w:val="Code"/>
+      </w:pPr>
+      <w:r>
+        <w:rPr>
+          <w:rFonts w:ascii="Consolas" w:hAnsi="Consolas"/>
+          <w:sz w:val="18"/>
+        </w:rPr>
+        <w:t xml:space="preserve">it would take a positive find in those two sources to overturn it.</w:t>
+      </w:r>
+    </w:p>
+    <w:p>
+      <w:pPr>
+        <w:pStyle w:val="Code"/>
+      </w:pPr>
+      <w:r>
+        <w:rPr>
+          <w:rFonts w:ascii="Consolas" w:hAnsi="Consolas"/>
+          <w:sz w:val="18"/>
+        </w:rPr>
+        <w:t xml:space="preserve"> </w:t>
+      </w:r>
+    </w:p>
+    <w:p>
+      <w:pPr>
+        <w:pStyle w:val="Code"/>
+      </w:pPr>
+      <w:r>
+        <w:rPr>
+          <w:rFonts w:ascii="Consolas" w:hAnsi="Consolas"/>
+          <w:sz w:val="18"/>
+        </w:rPr>
+        <w:t xml:space="preserve">**This note reports no archival finding of my own** — I have not read Zilch or the</w:t>
+      </w:r>
+    </w:p>
+    <w:p>
+      <w:pPr>
+        <w:pStyle w:val="Code"/>
+      </w:pPr>
+      <w:r>
+        <w:rPr>
+          <w:rFonts w:ascii="Consolas" w:hAnsi="Consolas"/>
+          <w:sz w:val="18"/>
+        </w:rPr>
+        <w:t xml:space="preserve">1914 report directly. It names the two sources that decide the question, records</w:t>
+      </w:r>
+    </w:p>
+    <w:p>
+      <w:pPr>
+        <w:pStyle w:val="Code"/>
+      </w:pPr>
+      <w:r>
+        <w:rPr>
+          <w:rFonts w:ascii="Consolas" w:hAnsi="Consolas"/>
+          <w:sz w:val="18"/>
+        </w:rPr>
+        <w:t xml:space="preserve">what the scholarship citing them already shows (a 1891 framework, no 5–23 July</w:t>
+      </w:r>
+    </w:p>
+    <w:p>
+      <w:pPr>
+        <w:pStyle w:val="Code"/>
+      </w:pPr>
+      <w:r>
+        <w:rPr>
+          <w:rFonts w:ascii="Consolas" w:hAnsi="Consolas"/>
+          <w:sz w:val="18"/>
+        </w:rPr>
+        <w:t xml:space="preserve">step, a short-war premise), and states which way the evidence now points. Read the</w:t>
+      </w:r>
+    </w:p>
+    <w:p>
+      <w:pPr>
+        <w:pStyle w:val="Code"/>
+      </w:pPr>
+      <w:r>
+        <w:rPr>
+          <w:rFonts w:ascii="Consolas" w:hAnsi="Consolas"/>
+          <w:sz w:val="18"/>
+        </w:rPr>
+        <w:t xml:space="preserve">two sources before asserting more.</w:t>
+      </w:r>
+    </w:p>
+    <w:p>
+      <w:pPr>
+        <w:pStyle w:val="Code"/>
+      </w:pPr>
+      <w:r>
+        <w:rPr>
+          <w:rFonts w:ascii="Consolas" w:hAnsi="Consolas"/>
+          <w:sz w:val="18"/>
+        </w:rPr>
+        <w:t xml:space="preserve"> </w:t>
+      </w:r>
+    </w:p>
+    <w:p>
+      <w:pPr>
+        <w:pStyle w:val="Code"/>
+      </w:pPr>
+      <w:r>
+        <w:rPr>
+          <w:rFonts w:ascii="Consolas" w:hAnsi="Consolas"/>
+          <w:sz w:val="18"/>
+        </w:rPr>
+        <w:t xml:space="preserve">##### Sources</w:t>
+      </w:r>
+    </w:p>
+    <w:p>
+      <w:pPr>
+        <w:pStyle w:val="Code"/>
+      </w:pPr>
+      <w:r>
+        <w:rPr>
+          <w:rFonts w:ascii="Consolas" w:hAnsi="Consolas"/>
+          <w:sz w:val="18"/>
+        </w:rPr>
+        <w:t xml:space="preserve"> </w:t>
+      </w:r>
+    </w:p>
+    <w:p>
+      <w:pPr>
+        <w:pStyle w:val="Code"/>
+      </w:pPr>
+      <w:r>
+        <w:rPr>
+          <w:rFonts w:ascii="Consolas" w:hAnsi="Consolas"/>
+          <w:sz w:val="18"/>
+        </w:rPr>
+        <w:t xml:space="preserve">- *1914-1918-Online, International Encyclopedia of the First World War*: "War</w:t>
+      </w:r>
+    </w:p>
+    <w:p>
+      <w:pPr>
+        <w:pStyle w:val="Code"/>
+      </w:pPr>
+      <w:r>
+        <w:rPr>
+          <w:rFonts w:ascii="Consolas" w:hAnsi="Consolas"/>
+          <w:sz w:val="18"/>
+        </w:rPr>
+        <w:t xml:space="preserve">  Finance (Germany)" and "War Finance and Monetary Consequences: The German Case</w:t>
+      </w:r>
+    </w:p>
+    <w:p>
+      <w:pPr>
+        <w:pStyle w:val="Code"/>
+      </w:pPr>
+      <w:r>
+        <w:rPr>
+          <w:rFonts w:ascii="Consolas" w:hAnsi="Consolas"/>
+          <w:sz w:val="18"/>
+        </w:rPr>
+        <w:t xml:space="preserve">  Revisited."</w:t>
+      </w:r>
+    </w:p>
+    <w:p>
+      <w:pPr>
+        <w:pStyle w:val="Code"/>
+      </w:pPr>
+      <w:r>
+        <w:rPr>
+          <w:rFonts w:ascii="Consolas" w:hAnsi="Consolas"/>
+          <w:sz w:val="18"/>
+        </w:rPr>
+        <w:t xml:space="preserve">- J. Popper (contemporary), "Germany's Financial Mobilization," *Quarterly Journal</w:t>
+      </w:r>
+    </w:p>
+    <w:p>
+      <w:pPr>
+        <w:pStyle w:val="Code"/>
+      </w:pPr>
+      <w:r>
+        <w:rPr>
+          <w:rFonts w:ascii="Consolas" w:hAnsi="Consolas"/>
+          <w:sz w:val="18"/>
+        </w:rPr>
+        <w:t xml:space="preserve">  of Economics* 29:4 (1915).</w:t>
+      </w:r>
+    </w:p>
+    <w:p>
+      <w:pPr>
+        <w:pStyle w:val="Code"/>
+      </w:pPr>
+      <w:r>
+        <w:rPr>
+          <w:rFonts w:ascii="Consolas" w:hAnsi="Consolas"/>
+          <w:sz w:val="18"/>
+        </w:rPr>
+        <w:t xml:space="preserve">- Flagged as unreliable for this purpose: Mises Institute, "The Reichsbank:</w:t>
+      </w:r>
+    </w:p>
+    <w:p>
+      <w:pPr>
+        <w:pStyle w:val="Code"/>
+      </w:pPr>
+      <w:r>
+        <w:rPr>
+          <w:rFonts w:ascii="Consolas" w:hAnsi="Consolas"/>
+          <w:sz w:val="18"/>
+        </w:rPr>
+        <w:t xml:space="preserve">  Germany's Central Bank Lays Foundation of Monetary Disaster" (op-ed).</w:t>
       </w:r>
     </w:p>
     <w:p>

</xml_diff>